<commit_message>
added instagram CTR without e2e testing
</commit_message>
<xml_diff>
--- a/CTR Tracking Tools.docx
+++ b/CTR Tracking Tools.docx
@@ -45,18 +45,1156 @@
           <w:sz w:val="36"/>
           <w:szCs w:val="36"/>
         </w:rPr>
-        <w:t>1️</w:t>
-      </w:r>
-      <w:r>
-        <w:rPr>
-          <w:rFonts w:ascii="Tahoma" w:eastAsia="Times New Roman" w:hAnsi="Tahoma" w:cs="Tahoma"/>
+        <w:t>1️ Platform-wise Official APIs &amp; Tools</w:t>
+      </w:r>
+    </w:p>
+    <w:p>
+      <w:pPr>
+        <w:spacing w:before="100" w:beforeAutospacing="1" w:after="100" w:afterAutospacing="1" w:line="240" w:lineRule="auto"/>
+        <w:outlineLvl w:val="2"/>
+        <w:rPr>
+          <w:rFonts w:ascii="Times New Roman" w:eastAsia="Times New Roman" w:hAnsi="Times New Roman" w:cs="Times New Roman"/>
+          <w:b/>
+          <w:bCs/>
+          <w:sz w:val="27"/>
+          <w:szCs w:val="27"/>
+        </w:rPr>
+      </w:pPr>
+      <w:proofErr w:type="spellStart"/>
+      <w:r>
+        <w:rPr>
+          <w:rFonts w:ascii="Times New Roman" w:eastAsia="Times New Roman" w:hAnsi="Times New Roman" w:cs="Times New Roman"/>
+          <w:b/>
+          <w:bCs/>
+          <w:sz w:val="27"/>
+          <w:szCs w:val="27"/>
+        </w:rPr>
+        <w:t>Instagram</w:t>
+      </w:r>
+      <w:proofErr w:type="spellEnd"/>
+    </w:p>
+    <w:p>
+      <w:pPr>
+        <w:numPr>
+          <w:ilvl w:val="0"/>
+          <w:numId w:val="1"/>
+        </w:numPr>
+        <w:spacing w:before="100" w:beforeAutospacing="1" w:after="100" w:afterAutospacing="1" w:line="240" w:lineRule="auto"/>
+        <w:rPr>
+          <w:rFonts w:ascii="Times New Roman" w:eastAsia="Times New Roman" w:hAnsi="Times New Roman" w:cs="Times New Roman"/>
+          <w:sz w:val="24"/>
+          <w:szCs w:val="24"/>
+        </w:rPr>
+      </w:pPr>
+      <w:r>
+        <w:rPr>
+          <w:rFonts w:ascii="Times New Roman" w:eastAsia="Times New Roman" w:hAnsi="Times New Roman" w:cs="Times New Roman"/>
+          <w:b/>
+          <w:bCs/>
+          <w:sz w:val="24"/>
+          <w:szCs w:val="24"/>
+        </w:rPr>
+        <w:t>Official API Available:</w:t>
+      </w:r>
+      <w:r>
+        <w:rPr>
+          <w:rFonts w:ascii="Times New Roman" w:eastAsia="Times New Roman" w:hAnsi="Times New Roman" w:cs="Times New Roman"/>
+          <w:sz w:val="24"/>
+          <w:szCs w:val="24"/>
+        </w:rPr>
+        <w:t xml:space="preserve">  Yes</w:t>
+      </w:r>
+    </w:p>
+    <w:p>
+      <w:pPr>
+        <w:numPr>
+          <w:ilvl w:val="1"/>
+          <w:numId w:val="1"/>
+        </w:numPr>
+        <w:spacing w:before="100" w:beforeAutospacing="1" w:after="100" w:afterAutospacing="1" w:line="240" w:lineRule="auto"/>
+        <w:rPr>
+          <w:rFonts w:ascii="Times New Roman" w:eastAsia="Times New Roman" w:hAnsi="Times New Roman" w:cs="Times New Roman"/>
+          <w:sz w:val="24"/>
+          <w:szCs w:val="24"/>
+        </w:rPr>
+      </w:pPr>
+      <w:r>
+        <w:rPr>
+          <w:rFonts w:ascii="Times New Roman" w:eastAsia="Times New Roman" w:hAnsi="Times New Roman" w:cs="Times New Roman"/>
+          <w:b/>
+          <w:bCs/>
+          <w:sz w:val="24"/>
+          <w:szCs w:val="24"/>
+        </w:rPr>
+        <w:t xml:space="preserve">Meta </w:t>
+      </w:r>
+      <w:proofErr w:type="spellStart"/>
+      <w:r>
+        <w:rPr>
+          <w:rFonts w:ascii="Times New Roman" w:eastAsia="Times New Roman" w:hAnsi="Times New Roman" w:cs="Times New Roman"/>
+          <w:b/>
+          <w:bCs/>
+          <w:sz w:val="24"/>
+          <w:szCs w:val="24"/>
+        </w:rPr>
+        <w:t>Instagram</w:t>
+      </w:r>
+      <w:proofErr w:type="spellEnd"/>
+      <w:r>
+        <w:rPr>
+          <w:rFonts w:ascii="Times New Roman" w:eastAsia="Times New Roman" w:hAnsi="Times New Roman" w:cs="Times New Roman"/>
+          <w:b/>
+          <w:bCs/>
+          <w:sz w:val="24"/>
+          <w:szCs w:val="24"/>
+        </w:rPr>
+        <w:t xml:space="preserve"> Graph API</w:t>
+      </w:r>
+    </w:p>
+    <w:p>
+      <w:pPr>
+        <w:numPr>
+          <w:ilvl w:val="1"/>
+          <w:numId w:val="1"/>
+        </w:numPr>
+        <w:spacing w:before="100" w:beforeAutospacing="1" w:after="100" w:afterAutospacing="1" w:line="240" w:lineRule="auto"/>
+        <w:rPr>
+          <w:rFonts w:ascii="Times New Roman" w:eastAsia="Times New Roman" w:hAnsi="Times New Roman" w:cs="Times New Roman"/>
+          <w:sz w:val="24"/>
+          <w:szCs w:val="24"/>
+        </w:rPr>
+      </w:pPr>
+      <w:r>
+        <w:rPr>
+          <w:rFonts w:ascii="Times New Roman" w:eastAsia="Times New Roman" w:hAnsi="Times New Roman" w:cs="Times New Roman"/>
+          <w:sz w:val="24"/>
+          <w:szCs w:val="24"/>
+        </w:rPr>
+        <w:t xml:space="preserve">Works </w:t>
+      </w:r>
+      <w:r>
+        <w:rPr>
+          <w:rFonts w:ascii="Times New Roman" w:eastAsia="Times New Roman" w:hAnsi="Times New Roman" w:cs="Times New Roman"/>
+          <w:b/>
+          <w:bCs/>
+          <w:sz w:val="24"/>
+          <w:szCs w:val="24"/>
+        </w:rPr>
+        <w:t>only for Creator / Business accounts</w:t>
+      </w:r>
+    </w:p>
+    <w:p>
+      <w:pPr>
+        <w:numPr>
+          <w:ilvl w:val="0"/>
+          <w:numId w:val="1"/>
+        </w:numPr>
+        <w:spacing w:before="100" w:beforeAutospacing="1" w:after="100" w:afterAutospacing="1" w:line="240" w:lineRule="auto"/>
+        <w:rPr>
+          <w:rFonts w:ascii="Times New Roman" w:eastAsia="Times New Roman" w:hAnsi="Times New Roman" w:cs="Times New Roman"/>
+          <w:sz w:val="24"/>
+          <w:szCs w:val="24"/>
+        </w:rPr>
+      </w:pPr>
+      <w:r>
+        <w:rPr>
+          <w:rFonts w:ascii="Times New Roman" w:eastAsia="Times New Roman" w:hAnsi="Times New Roman" w:cs="Times New Roman"/>
+          <w:b/>
+          <w:bCs/>
+          <w:sz w:val="24"/>
+          <w:szCs w:val="24"/>
+        </w:rPr>
+        <w:t>Limitations:</w:t>
+      </w:r>
+    </w:p>
+    <w:p>
+      <w:pPr>
+        <w:numPr>
+          <w:ilvl w:val="1"/>
+          <w:numId w:val="1"/>
+        </w:numPr>
+        <w:spacing w:before="100" w:beforeAutospacing="1" w:after="100" w:afterAutospacing="1" w:line="240" w:lineRule="auto"/>
+        <w:rPr>
+          <w:rFonts w:ascii="Times New Roman" w:eastAsia="Times New Roman" w:hAnsi="Times New Roman" w:cs="Times New Roman"/>
+          <w:sz w:val="24"/>
+          <w:szCs w:val="24"/>
+        </w:rPr>
+      </w:pPr>
+      <w:r>
+        <w:rPr>
+          <w:rFonts w:ascii="Times New Roman" w:eastAsia="Times New Roman" w:hAnsi="Times New Roman" w:cs="Times New Roman"/>
+          <w:sz w:val="24"/>
+          <w:szCs w:val="24"/>
+        </w:rPr>
+        <w:t xml:space="preserve"> No profile visits</w:t>
+      </w:r>
+    </w:p>
+    <w:p>
+      <w:pPr>
+        <w:numPr>
+          <w:ilvl w:val="1"/>
+          <w:numId w:val="1"/>
+        </w:numPr>
+        <w:spacing w:before="100" w:beforeAutospacing="1" w:after="100" w:afterAutospacing="1" w:line="240" w:lineRule="auto"/>
+        <w:rPr>
+          <w:rFonts w:ascii="Times New Roman" w:eastAsia="Times New Roman" w:hAnsi="Times New Roman" w:cs="Times New Roman"/>
+          <w:sz w:val="24"/>
+          <w:szCs w:val="24"/>
+        </w:rPr>
+      </w:pPr>
+      <w:r>
+        <w:rPr>
+          <w:rFonts w:ascii="Times New Roman" w:eastAsia="Times New Roman" w:hAnsi="Times New Roman" w:cs="Times New Roman"/>
+          <w:sz w:val="24"/>
+          <w:szCs w:val="24"/>
+        </w:rPr>
+        <w:t xml:space="preserve"> No link taps</w:t>
+      </w:r>
+    </w:p>
+    <w:p>
+      <w:pPr>
+        <w:numPr>
+          <w:ilvl w:val="1"/>
+          <w:numId w:val="1"/>
+        </w:numPr>
+        <w:spacing w:before="100" w:beforeAutospacing="1" w:after="100" w:afterAutospacing="1" w:line="240" w:lineRule="auto"/>
+        <w:rPr>
+          <w:rFonts w:ascii="Times New Roman" w:eastAsia="Times New Roman" w:hAnsi="Times New Roman" w:cs="Times New Roman"/>
+          <w:sz w:val="24"/>
+          <w:szCs w:val="24"/>
+        </w:rPr>
+      </w:pPr>
+      <w:r>
+        <w:rPr>
+          <w:rFonts w:ascii="Times New Roman" w:eastAsia="Times New Roman" w:hAnsi="Times New Roman" w:cs="Times New Roman"/>
+          <w:sz w:val="24"/>
+          <w:szCs w:val="24"/>
+        </w:rPr>
+        <w:t xml:space="preserve"> No following count</w:t>
+      </w:r>
+    </w:p>
+    <w:p>
+      <w:pPr>
+        <w:numPr>
+          <w:ilvl w:val="0"/>
+          <w:numId w:val="1"/>
+        </w:numPr>
+        <w:spacing w:before="100" w:beforeAutospacing="1" w:after="100" w:afterAutospacing="1" w:line="240" w:lineRule="auto"/>
+        <w:rPr>
+          <w:rFonts w:ascii="Times New Roman" w:eastAsia="Times New Roman" w:hAnsi="Times New Roman" w:cs="Times New Roman"/>
+          <w:sz w:val="24"/>
+          <w:szCs w:val="24"/>
+        </w:rPr>
+      </w:pPr>
+      <w:r>
+        <w:rPr>
+          <w:rFonts w:ascii="Times New Roman" w:eastAsia="Times New Roman" w:hAnsi="Times New Roman" w:cs="Times New Roman"/>
+          <w:b/>
+          <w:bCs/>
+          <w:sz w:val="24"/>
+          <w:szCs w:val="24"/>
+        </w:rPr>
+        <w:t>Tool Used:</w:t>
+      </w:r>
+    </w:p>
+    <w:p>
+      <w:pPr>
+        <w:numPr>
+          <w:ilvl w:val="1"/>
+          <w:numId w:val="1"/>
+        </w:numPr>
+        <w:spacing w:before="100" w:beforeAutospacing="1" w:after="100" w:afterAutospacing="1" w:line="240" w:lineRule="auto"/>
+        <w:rPr>
+          <w:rFonts w:ascii="Times New Roman" w:eastAsia="Times New Roman" w:hAnsi="Times New Roman" w:cs="Times New Roman"/>
+          <w:sz w:val="24"/>
+          <w:szCs w:val="24"/>
+        </w:rPr>
+      </w:pPr>
+      <w:proofErr w:type="spellStart"/>
+      <w:r>
+        <w:rPr>
+          <w:rFonts w:ascii="Times New Roman" w:eastAsia="Times New Roman" w:hAnsi="Times New Roman" w:cs="Times New Roman"/>
+          <w:b/>
+          <w:bCs/>
+          <w:sz w:val="24"/>
+          <w:szCs w:val="24"/>
+        </w:rPr>
+        <w:t>Apify</w:t>
+      </w:r>
+      <w:proofErr w:type="spellEnd"/>
+      <w:r>
+        <w:rPr>
+          <w:rFonts w:ascii="Times New Roman" w:eastAsia="Times New Roman" w:hAnsi="Times New Roman" w:cs="Times New Roman"/>
+          <w:b/>
+          <w:bCs/>
+          <w:sz w:val="24"/>
+          <w:szCs w:val="24"/>
+        </w:rPr>
+        <w:t xml:space="preserve"> – </w:t>
+      </w:r>
+      <w:proofErr w:type="spellStart"/>
+      <w:r>
+        <w:rPr>
+          <w:rFonts w:ascii="Times New Roman" w:eastAsia="Times New Roman" w:hAnsi="Times New Roman" w:cs="Times New Roman"/>
+          <w:b/>
+          <w:bCs/>
+          <w:sz w:val="24"/>
+          <w:szCs w:val="24"/>
+        </w:rPr>
+        <w:t>Instagram</w:t>
+      </w:r>
+      <w:proofErr w:type="spellEnd"/>
+      <w:r>
+        <w:rPr>
+          <w:rFonts w:ascii="Times New Roman" w:eastAsia="Times New Roman" w:hAnsi="Times New Roman" w:cs="Times New Roman"/>
+          <w:b/>
+          <w:bCs/>
+          <w:sz w:val="24"/>
+          <w:szCs w:val="24"/>
+        </w:rPr>
+        <w:t xml:space="preserve"> Profile Scraper (No Login)</w:t>
+      </w:r>
+      <w:r>
+        <w:rPr>
+          <w:rFonts w:ascii="Times New Roman" w:eastAsia="Times New Roman" w:hAnsi="Times New Roman" w:cs="Times New Roman"/>
+          <w:sz w:val="24"/>
+          <w:szCs w:val="24"/>
+        </w:rPr>
+        <w:t xml:space="preserve"> for public stats</w:t>
+      </w:r>
+    </w:p>
+    <w:p>
+      <w:pPr>
+        <w:spacing w:before="100" w:beforeAutospacing="1" w:after="100" w:afterAutospacing="1" w:line="240" w:lineRule="auto"/>
+        <w:outlineLvl w:val="2"/>
+        <w:rPr>
+          <w:rFonts w:ascii="Times New Roman" w:eastAsia="Times New Roman" w:hAnsi="Times New Roman" w:cs="Times New Roman"/>
+          <w:b/>
+          <w:bCs/>
+          <w:sz w:val="27"/>
+          <w:szCs w:val="27"/>
+        </w:rPr>
+      </w:pPr>
+      <w:proofErr w:type="spellStart"/>
+      <w:r>
+        <w:rPr>
+          <w:rFonts w:ascii="Times New Roman" w:eastAsia="Times New Roman" w:hAnsi="Times New Roman" w:cs="Times New Roman"/>
+          <w:b/>
+          <w:bCs/>
+          <w:sz w:val="27"/>
+          <w:szCs w:val="27"/>
+        </w:rPr>
+        <w:t>Reddit</w:t>
+      </w:r>
+      <w:proofErr w:type="spellEnd"/>
+    </w:p>
+    <w:p>
+      <w:pPr>
+        <w:numPr>
+          <w:ilvl w:val="0"/>
+          <w:numId w:val="2"/>
+        </w:numPr>
+        <w:spacing w:before="100" w:beforeAutospacing="1" w:after="100" w:afterAutospacing="1" w:line="240" w:lineRule="auto"/>
+        <w:rPr>
+          <w:rFonts w:ascii="Times New Roman" w:eastAsia="Times New Roman" w:hAnsi="Times New Roman" w:cs="Times New Roman"/>
+          <w:sz w:val="24"/>
+          <w:szCs w:val="24"/>
+        </w:rPr>
+      </w:pPr>
+      <w:r>
+        <w:rPr>
+          <w:rFonts w:ascii="Times New Roman" w:eastAsia="Times New Roman" w:hAnsi="Times New Roman" w:cs="Times New Roman"/>
+          <w:b/>
+          <w:bCs/>
+          <w:sz w:val="24"/>
+          <w:szCs w:val="24"/>
+        </w:rPr>
+        <w:t>Official API Available:</w:t>
+      </w:r>
+      <w:r>
+        <w:rPr>
+          <w:rFonts w:ascii="Times New Roman" w:eastAsia="Times New Roman" w:hAnsi="Times New Roman" w:cs="Times New Roman"/>
+          <w:sz w:val="24"/>
+          <w:szCs w:val="24"/>
+        </w:rPr>
+        <w:t xml:space="preserve">  Yes</w:t>
+      </w:r>
+    </w:p>
+    <w:p>
+      <w:pPr>
+        <w:numPr>
+          <w:ilvl w:val="1"/>
+          <w:numId w:val="2"/>
+        </w:numPr>
+        <w:spacing w:before="100" w:beforeAutospacing="1" w:after="100" w:afterAutospacing="1" w:line="240" w:lineRule="auto"/>
+        <w:rPr>
+          <w:rFonts w:ascii="Times New Roman" w:eastAsia="Times New Roman" w:hAnsi="Times New Roman" w:cs="Times New Roman"/>
+          <w:sz w:val="24"/>
+          <w:szCs w:val="24"/>
+        </w:rPr>
+      </w:pPr>
+      <w:proofErr w:type="spellStart"/>
+      <w:r>
+        <w:rPr>
+          <w:rFonts w:ascii="Times New Roman" w:eastAsia="Times New Roman" w:hAnsi="Times New Roman" w:cs="Times New Roman"/>
+          <w:sz w:val="24"/>
+          <w:szCs w:val="24"/>
+        </w:rPr>
+        <w:t>Reddit</w:t>
+      </w:r>
+      <w:proofErr w:type="spellEnd"/>
+      <w:r>
+        <w:rPr>
+          <w:rFonts w:ascii="Times New Roman" w:eastAsia="Times New Roman" w:hAnsi="Times New Roman" w:cs="Times New Roman"/>
+          <w:sz w:val="24"/>
+          <w:szCs w:val="24"/>
+        </w:rPr>
+        <w:t xml:space="preserve"> </w:t>
+      </w:r>
+      <w:proofErr w:type="spellStart"/>
+      <w:r>
+        <w:rPr>
+          <w:rFonts w:ascii="Times New Roman" w:eastAsia="Times New Roman" w:hAnsi="Times New Roman" w:cs="Times New Roman"/>
+          <w:sz w:val="24"/>
+          <w:szCs w:val="24"/>
+        </w:rPr>
+        <w:t>OAuth</w:t>
+      </w:r>
+      <w:proofErr w:type="spellEnd"/>
+      <w:r>
+        <w:rPr>
+          <w:rFonts w:ascii="Times New Roman" w:eastAsia="Times New Roman" w:hAnsi="Times New Roman" w:cs="Times New Roman"/>
+          <w:sz w:val="24"/>
+          <w:szCs w:val="24"/>
+        </w:rPr>
+        <w:t xml:space="preserve"> API (posts, comments, activity)</w:t>
+      </w:r>
+    </w:p>
+    <w:p>
+      <w:pPr>
+        <w:numPr>
+          <w:ilvl w:val="0"/>
+          <w:numId w:val="2"/>
+        </w:numPr>
+        <w:spacing w:before="100" w:beforeAutospacing="1" w:after="100" w:afterAutospacing="1" w:line="240" w:lineRule="auto"/>
+        <w:rPr>
+          <w:rFonts w:ascii="Times New Roman" w:eastAsia="Times New Roman" w:hAnsi="Times New Roman" w:cs="Times New Roman"/>
+          <w:sz w:val="24"/>
+          <w:szCs w:val="24"/>
+        </w:rPr>
+      </w:pPr>
+      <w:r>
+        <w:rPr>
+          <w:rFonts w:ascii="Times New Roman" w:eastAsia="Times New Roman" w:hAnsi="Times New Roman" w:cs="Times New Roman"/>
+          <w:b/>
+          <w:bCs/>
+          <w:sz w:val="24"/>
+          <w:szCs w:val="24"/>
+        </w:rPr>
+        <w:t>Fallback (Public):</w:t>
+      </w:r>
+    </w:p>
+    <w:p>
+      <w:pPr>
+        <w:numPr>
+          <w:ilvl w:val="1"/>
+          <w:numId w:val="2"/>
+        </w:numPr>
+        <w:spacing w:before="100" w:beforeAutospacing="1" w:after="100" w:afterAutospacing="1" w:line="240" w:lineRule="auto"/>
+        <w:rPr>
+          <w:rFonts w:ascii="Times New Roman" w:eastAsia="Times New Roman" w:hAnsi="Times New Roman" w:cs="Times New Roman"/>
+          <w:sz w:val="24"/>
+          <w:szCs w:val="24"/>
+        </w:rPr>
+      </w:pPr>
+      <w:r>
+        <w:rPr>
+          <w:rFonts w:ascii="Times New Roman" w:eastAsia="Times New Roman" w:hAnsi="Times New Roman" w:cs="Times New Roman"/>
+          <w:sz w:val="20"/>
+          <w:szCs w:val="20"/>
+        </w:rPr>
+        <w:t>/user/{username}/.</w:t>
+      </w:r>
+      <w:proofErr w:type="spellStart"/>
+      <w:r>
+        <w:rPr>
+          <w:rFonts w:ascii="Times New Roman" w:eastAsia="Times New Roman" w:hAnsi="Times New Roman" w:cs="Times New Roman"/>
+          <w:sz w:val="20"/>
+          <w:szCs w:val="20"/>
+        </w:rPr>
+        <w:t>json</w:t>
+      </w:r>
+      <w:proofErr w:type="spellEnd"/>
+      <w:r>
+        <w:rPr>
+          <w:rFonts w:ascii="Times New Roman" w:eastAsia="Times New Roman" w:hAnsi="Times New Roman" w:cs="Times New Roman"/>
+          <w:sz w:val="24"/>
+          <w:szCs w:val="24"/>
+        </w:rPr>
+        <w:t xml:space="preserve"> (no login)</w:t>
+      </w:r>
+    </w:p>
+    <w:p>
+      <w:pPr>
+        <w:numPr>
+          <w:ilvl w:val="0"/>
+          <w:numId w:val="2"/>
+        </w:numPr>
+        <w:spacing w:before="100" w:beforeAutospacing="1" w:after="100" w:afterAutospacing="1" w:line="240" w:lineRule="auto"/>
+        <w:rPr>
+          <w:rFonts w:ascii="Times New Roman" w:eastAsia="Times New Roman" w:hAnsi="Times New Roman" w:cs="Times New Roman"/>
+          <w:sz w:val="24"/>
+          <w:szCs w:val="24"/>
+        </w:rPr>
+      </w:pPr>
+      <w:r>
+        <w:rPr>
+          <w:rFonts w:ascii="Times New Roman" w:eastAsia="Times New Roman" w:hAnsi="Times New Roman" w:cs="Times New Roman"/>
+          <w:b/>
+          <w:bCs/>
+          <w:sz w:val="24"/>
+          <w:szCs w:val="24"/>
+        </w:rPr>
+        <w:t>Data Available:</w:t>
+      </w:r>
+    </w:p>
+    <w:p>
+      <w:pPr>
+        <w:numPr>
+          <w:ilvl w:val="1"/>
+          <w:numId w:val="2"/>
+        </w:numPr>
+        <w:spacing w:before="100" w:beforeAutospacing="1" w:after="100" w:afterAutospacing="1" w:line="240" w:lineRule="auto"/>
+        <w:rPr>
+          <w:rFonts w:ascii="Times New Roman" w:eastAsia="Times New Roman" w:hAnsi="Times New Roman" w:cs="Times New Roman"/>
+          <w:sz w:val="24"/>
+          <w:szCs w:val="24"/>
+        </w:rPr>
+      </w:pPr>
+      <w:r>
+        <w:rPr>
+          <w:rFonts w:ascii="Times New Roman" w:eastAsia="Times New Roman" w:hAnsi="Times New Roman" w:cs="Times New Roman"/>
+          <w:sz w:val="24"/>
+          <w:szCs w:val="24"/>
+        </w:rPr>
+        <w:t>Posts, comments, timestamps, engagement</w:t>
+      </w:r>
+    </w:p>
+    <w:p>
+      <w:pPr>
+        <w:numPr>
+          <w:ilvl w:val="0"/>
+          <w:numId w:val="2"/>
+        </w:numPr>
+        <w:spacing w:before="100" w:beforeAutospacing="1" w:after="100" w:afterAutospacing="1" w:line="240" w:lineRule="auto"/>
+        <w:rPr>
+          <w:rFonts w:ascii="Times New Roman" w:eastAsia="Times New Roman" w:hAnsi="Times New Roman" w:cs="Times New Roman"/>
+          <w:sz w:val="24"/>
+          <w:szCs w:val="24"/>
+        </w:rPr>
+      </w:pPr>
+      <w:r>
+        <w:rPr>
+          <w:rFonts w:ascii="Times New Roman" w:eastAsia="Times New Roman" w:hAnsi="Times New Roman" w:cs="Times New Roman"/>
+          <w:b/>
+          <w:bCs/>
+          <w:sz w:val="24"/>
+          <w:szCs w:val="24"/>
+        </w:rPr>
+        <w:t>Tool Used:</w:t>
+      </w:r>
+    </w:p>
+    <w:p>
+      <w:pPr>
+        <w:numPr>
+          <w:ilvl w:val="1"/>
+          <w:numId w:val="2"/>
+        </w:numPr>
+        <w:spacing w:before="100" w:beforeAutospacing="1" w:after="100" w:afterAutospacing="1" w:line="240" w:lineRule="auto"/>
+        <w:rPr>
+          <w:rFonts w:ascii="Times New Roman" w:eastAsia="Times New Roman" w:hAnsi="Times New Roman" w:cs="Times New Roman"/>
+          <w:sz w:val="24"/>
+          <w:szCs w:val="24"/>
+        </w:rPr>
+      </w:pPr>
+      <w:proofErr w:type="spellStart"/>
+      <w:r>
+        <w:rPr>
+          <w:rFonts w:ascii="Times New Roman" w:eastAsia="Times New Roman" w:hAnsi="Times New Roman" w:cs="Times New Roman"/>
+          <w:sz w:val="24"/>
+          <w:szCs w:val="24"/>
+        </w:rPr>
+        <w:t>Reddit</w:t>
+      </w:r>
+      <w:proofErr w:type="spellEnd"/>
+      <w:r>
+        <w:rPr>
+          <w:rFonts w:ascii="Times New Roman" w:eastAsia="Times New Roman" w:hAnsi="Times New Roman" w:cs="Times New Roman"/>
+          <w:sz w:val="24"/>
+          <w:szCs w:val="24"/>
+        </w:rPr>
+        <w:t xml:space="preserve"> API or Public </w:t>
+      </w:r>
+      <w:r>
+        <w:rPr>
+          <w:rFonts w:ascii="Times New Roman" w:eastAsia="Times New Roman" w:hAnsi="Times New Roman" w:cs="Times New Roman"/>
+          <w:sz w:val="20"/>
+          <w:szCs w:val="20"/>
+        </w:rPr>
+        <w:t>.</w:t>
+      </w:r>
+      <w:proofErr w:type="spellStart"/>
+      <w:r>
+        <w:rPr>
+          <w:rFonts w:ascii="Times New Roman" w:eastAsia="Times New Roman" w:hAnsi="Times New Roman" w:cs="Times New Roman"/>
+          <w:sz w:val="20"/>
+          <w:szCs w:val="20"/>
+        </w:rPr>
+        <w:t>json</w:t>
+      </w:r>
+      <w:proofErr w:type="spellEnd"/>
+    </w:p>
+    <w:p>
+      <w:pPr>
+        <w:numPr>
+          <w:ilvl w:val="1"/>
+          <w:numId w:val="2"/>
+        </w:numPr>
+        <w:spacing w:before="100" w:beforeAutospacing="1" w:after="100" w:afterAutospacing="1" w:line="240" w:lineRule="auto"/>
+        <w:rPr>
+          <w:rFonts w:ascii="Times New Roman" w:eastAsia="Times New Roman" w:hAnsi="Times New Roman" w:cs="Times New Roman"/>
+          <w:sz w:val="24"/>
+          <w:szCs w:val="24"/>
+        </w:rPr>
+      </w:pPr>
+      <w:r>
+        <w:rPr>
+          <w:rFonts w:ascii="Times New Roman" w:eastAsia="Times New Roman" w:hAnsi="Times New Roman" w:cs="Times New Roman"/>
+          <w:sz w:val="24"/>
+          <w:szCs w:val="24"/>
+        </w:rPr>
+        <w:t xml:space="preserve"> </w:t>
+      </w:r>
+      <w:proofErr w:type="spellStart"/>
+      <w:r>
+        <w:rPr>
+          <w:rFonts w:ascii="Times New Roman" w:eastAsia="Times New Roman" w:hAnsi="Times New Roman" w:cs="Times New Roman"/>
+          <w:sz w:val="24"/>
+          <w:szCs w:val="24"/>
+        </w:rPr>
+        <w:t>Apify</w:t>
+      </w:r>
+      <w:proofErr w:type="spellEnd"/>
+      <w:r>
+        <w:rPr>
+          <w:rFonts w:ascii="Times New Roman" w:eastAsia="Times New Roman" w:hAnsi="Times New Roman" w:cs="Times New Roman"/>
+          <w:sz w:val="24"/>
+          <w:szCs w:val="24"/>
+        </w:rPr>
+        <w:t xml:space="preserve"> not required</w:t>
+      </w:r>
+    </w:p>
+    <w:p>
+      <w:pPr>
+        <w:numPr>
+          <w:ilvl w:val="0"/>
+          <w:numId w:val="2"/>
+        </w:numPr>
+        <w:spacing w:before="100" w:beforeAutospacing="1" w:after="100" w:afterAutospacing="1" w:line="240" w:lineRule="auto"/>
+        <w:rPr>
+          <w:rFonts w:ascii="Times New Roman" w:eastAsia="Times New Roman" w:hAnsi="Times New Roman" w:cs="Times New Roman"/>
+          <w:sz w:val="24"/>
+          <w:szCs w:val="24"/>
+        </w:rPr>
+      </w:pPr>
+      <w:r>
+        <w:rPr>
+          <w:rFonts w:ascii="Times New Roman" w:eastAsia="Times New Roman" w:hAnsi="Times New Roman" w:cs="Times New Roman"/>
+          <w:b/>
+          <w:bCs/>
+          <w:sz w:val="24"/>
+          <w:szCs w:val="24"/>
+        </w:rPr>
+        <w:t>Cost:</w:t>
+      </w:r>
+      <w:r>
+        <w:rPr>
+          <w:rFonts w:ascii="Times New Roman" w:eastAsia="Times New Roman" w:hAnsi="Times New Roman" w:cs="Times New Roman"/>
+          <w:sz w:val="24"/>
+          <w:szCs w:val="24"/>
+        </w:rPr>
+        <w:t xml:space="preserve"> $0</w:t>
+      </w:r>
+    </w:p>
+    <w:p>
+      <w:pPr>
+        <w:spacing w:before="100" w:beforeAutospacing="1" w:after="100" w:afterAutospacing="1" w:line="240" w:lineRule="auto"/>
+        <w:outlineLvl w:val="2"/>
+        <w:rPr>
+          <w:rFonts w:ascii="Times New Roman" w:eastAsia="Times New Roman" w:hAnsi="Times New Roman" w:cs="Times New Roman"/>
+          <w:b/>
+          <w:bCs/>
+          <w:sz w:val="27"/>
+          <w:szCs w:val="27"/>
+        </w:rPr>
+      </w:pPr>
+      <w:proofErr w:type="spellStart"/>
+      <w:r>
+        <w:rPr>
+          <w:rFonts w:ascii="Times New Roman" w:eastAsia="Times New Roman" w:hAnsi="Times New Roman" w:cs="Times New Roman"/>
+          <w:b/>
+          <w:bCs/>
+          <w:sz w:val="27"/>
+          <w:szCs w:val="27"/>
+        </w:rPr>
+        <w:t>Quora</w:t>
+      </w:r>
+      <w:proofErr w:type="spellEnd"/>
+    </w:p>
+    <w:p>
+      <w:pPr>
+        <w:numPr>
+          <w:ilvl w:val="0"/>
+          <w:numId w:val="3"/>
+        </w:numPr>
+        <w:spacing w:before="100" w:beforeAutospacing="1" w:after="100" w:afterAutospacing="1" w:line="240" w:lineRule="auto"/>
+        <w:rPr>
+          <w:rFonts w:ascii="Times New Roman" w:eastAsia="Times New Roman" w:hAnsi="Times New Roman" w:cs="Times New Roman"/>
+          <w:sz w:val="24"/>
+          <w:szCs w:val="24"/>
+        </w:rPr>
+      </w:pPr>
+      <w:r>
+        <w:rPr>
+          <w:rFonts w:ascii="Times New Roman" w:eastAsia="Times New Roman" w:hAnsi="Times New Roman" w:cs="Times New Roman"/>
+          <w:b/>
+          <w:bCs/>
+          <w:sz w:val="24"/>
+          <w:szCs w:val="24"/>
+        </w:rPr>
+        <w:t>Official API Available:</w:t>
+      </w:r>
+      <w:r>
+        <w:rPr>
+          <w:rFonts w:ascii="Times New Roman" w:eastAsia="Times New Roman" w:hAnsi="Times New Roman" w:cs="Times New Roman"/>
+          <w:sz w:val="24"/>
+          <w:szCs w:val="24"/>
+        </w:rPr>
+        <w:t xml:space="preserve">  No</w:t>
+      </w:r>
+    </w:p>
+    <w:p>
+      <w:pPr>
+        <w:numPr>
+          <w:ilvl w:val="0"/>
+          <w:numId w:val="3"/>
+        </w:numPr>
+        <w:spacing w:before="100" w:beforeAutospacing="1" w:after="100" w:afterAutospacing="1" w:line="240" w:lineRule="auto"/>
+        <w:rPr>
+          <w:rFonts w:ascii="Times New Roman" w:eastAsia="Times New Roman" w:hAnsi="Times New Roman" w:cs="Times New Roman"/>
+          <w:sz w:val="24"/>
+          <w:szCs w:val="24"/>
+        </w:rPr>
+      </w:pPr>
+      <w:r>
+        <w:rPr>
+          <w:rFonts w:ascii="Times New Roman" w:eastAsia="Times New Roman" w:hAnsi="Times New Roman" w:cs="Times New Roman"/>
+          <w:b/>
+          <w:bCs/>
+          <w:sz w:val="24"/>
+          <w:szCs w:val="24"/>
+        </w:rPr>
+        <w:t>Tool Used:</w:t>
+      </w:r>
+    </w:p>
+    <w:p>
+      <w:pPr>
+        <w:numPr>
+          <w:ilvl w:val="1"/>
+          <w:numId w:val="3"/>
+        </w:numPr>
+        <w:spacing w:before="100" w:beforeAutospacing="1" w:after="100" w:afterAutospacing="1" w:line="240" w:lineRule="auto"/>
+        <w:rPr>
+          <w:rFonts w:ascii="Times New Roman" w:eastAsia="Times New Roman" w:hAnsi="Times New Roman" w:cs="Times New Roman"/>
+          <w:sz w:val="24"/>
+          <w:szCs w:val="24"/>
+        </w:rPr>
+      </w:pPr>
+      <w:proofErr w:type="spellStart"/>
+      <w:r>
+        <w:rPr>
+          <w:rFonts w:ascii="Times New Roman" w:eastAsia="Times New Roman" w:hAnsi="Times New Roman" w:cs="Times New Roman"/>
+          <w:b/>
+          <w:bCs/>
+          <w:sz w:val="24"/>
+          <w:szCs w:val="24"/>
+        </w:rPr>
+        <w:t>Apify</w:t>
+      </w:r>
+      <w:proofErr w:type="spellEnd"/>
+      <w:r>
+        <w:rPr>
+          <w:rFonts w:ascii="Times New Roman" w:eastAsia="Times New Roman" w:hAnsi="Times New Roman" w:cs="Times New Roman"/>
+          <w:b/>
+          <w:bCs/>
+          <w:sz w:val="24"/>
+          <w:szCs w:val="24"/>
+        </w:rPr>
+        <w:t xml:space="preserve"> – Generic Web Scraper (No Login)</w:t>
+      </w:r>
+    </w:p>
+    <w:p>
+      <w:pPr>
+        <w:numPr>
+          <w:ilvl w:val="0"/>
+          <w:numId w:val="3"/>
+        </w:numPr>
+        <w:spacing w:before="100" w:beforeAutospacing="1" w:after="100" w:afterAutospacing="1" w:line="240" w:lineRule="auto"/>
+        <w:rPr>
+          <w:rFonts w:ascii="Times New Roman" w:eastAsia="Times New Roman" w:hAnsi="Times New Roman" w:cs="Times New Roman"/>
+          <w:sz w:val="24"/>
+          <w:szCs w:val="24"/>
+        </w:rPr>
+      </w:pPr>
+      <w:r>
+        <w:rPr>
+          <w:rFonts w:ascii="Times New Roman" w:eastAsia="Times New Roman" w:hAnsi="Times New Roman" w:cs="Times New Roman"/>
+          <w:b/>
+          <w:bCs/>
+          <w:sz w:val="24"/>
+          <w:szCs w:val="24"/>
+        </w:rPr>
+        <w:t>Data Available:</w:t>
+      </w:r>
+    </w:p>
+    <w:p>
+      <w:pPr>
+        <w:numPr>
+          <w:ilvl w:val="1"/>
+          <w:numId w:val="3"/>
+        </w:numPr>
+        <w:spacing w:before="100" w:beforeAutospacing="1" w:after="100" w:afterAutospacing="1" w:line="240" w:lineRule="auto"/>
+        <w:rPr>
+          <w:rFonts w:ascii="Times New Roman" w:eastAsia="Times New Roman" w:hAnsi="Times New Roman" w:cs="Times New Roman"/>
+          <w:sz w:val="24"/>
+          <w:szCs w:val="24"/>
+        </w:rPr>
+      </w:pPr>
+      <w:r>
+        <w:rPr>
+          <w:rFonts w:ascii="Times New Roman" w:eastAsia="Times New Roman" w:hAnsi="Times New Roman" w:cs="Times New Roman"/>
+          <w:sz w:val="24"/>
+          <w:szCs w:val="24"/>
+        </w:rPr>
+        <w:t>Answer count</w:t>
+      </w:r>
+    </w:p>
+    <w:p>
+      <w:pPr>
+        <w:numPr>
+          <w:ilvl w:val="1"/>
+          <w:numId w:val="3"/>
+        </w:numPr>
+        <w:spacing w:before="100" w:beforeAutospacing="1" w:after="100" w:afterAutospacing="1" w:line="240" w:lineRule="auto"/>
+        <w:rPr>
+          <w:rFonts w:ascii="Times New Roman" w:eastAsia="Times New Roman" w:hAnsi="Times New Roman" w:cs="Times New Roman"/>
+          <w:sz w:val="24"/>
+          <w:szCs w:val="24"/>
+        </w:rPr>
+      </w:pPr>
+      <w:r>
+        <w:rPr>
+          <w:rFonts w:ascii="Times New Roman" w:eastAsia="Times New Roman" w:hAnsi="Times New Roman" w:cs="Times New Roman"/>
+          <w:sz w:val="24"/>
+          <w:szCs w:val="24"/>
+        </w:rPr>
+        <w:t>Followers (public)</w:t>
+      </w:r>
+    </w:p>
+    <w:p>
+      <w:pPr>
+        <w:numPr>
+          <w:ilvl w:val="1"/>
+          <w:numId w:val="3"/>
+        </w:numPr>
+        <w:spacing w:before="100" w:beforeAutospacing="1" w:after="100" w:afterAutospacing="1" w:line="240" w:lineRule="auto"/>
+        <w:rPr>
+          <w:rFonts w:ascii="Times New Roman" w:eastAsia="Times New Roman" w:hAnsi="Times New Roman" w:cs="Times New Roman"/>
+          <w:sz w:val="24"/>
+          <w:szCs w:val="24"/>
+        </w:rPr>
+      </w:pPr>
+      <w:r>
+        <w:rPr>
+          <w:rFonts w:ascii="Times New Roman" w:eastAsia="Times New Roman" w:hAnsi="Times New Roman" w:cs="Times New Roman"/>
+          <w:sz w:val="24"/>
+          <w:szCs w:val="24"/>
+        </w:rPr>
+        <w:t>Profile snapshot</w:t>
+      </w:r>
+    </w:p>
+    <w:p>
+      <w:pPr>
+        <w:spacing w:before="100" w:beforeAutospacing="1" w:after="100" w:afterAutospacing="1" w:line="240" w:lineRule="auto"/>
+        <w:outlineLvl w:val="2"/>
+        <w:rPr>
+          <w:rFonts w:ascii="Times New Roman" w:eastAsia="Times New Roman" w:hAnsi="Times New Roman" w:cs="Times New Roman"/>
+          <w:b/>
+          <w:bCs/>
+          <w:sz w:val="27"/>
+          <w:szCs w:val="27"/>
+        </w:rPr>
+      </w:pPr>
+      <w:r>
+        <w:rPr>
+          <w:rFonts w:ascii="Times New Roman" w:eastAsia="Times New Roman" w:hAnsi="Times New Roman" w:cs="Times New Roman"/>
+          <w:b/>
+          <w:bCs/>
+          <w:sz w:val="27"/>
+          <w:szCs w:val="27"/>
+        </w:rPr>
+        <w:t>BHW (</w:t>
+      </w:r>
+      <w:proofErr w:type="spellStart"/>
+      <w:r>
+        <w:rPr>
+          <w:rFonts w:ascii="Times New Roman" w:eastAsia="Times New Roman" w:hAnsi="Times New Roman" w:cs="Times New Roman"/>
+          <w:b/>
+          <w:bCs/>
+          <w:sz w:val="27"/>
+          <w:szCs w:val="27"/>
+        </w:rPr>
+        <w:t>BlackHatWorld</w:t>
+      </w:r>
+      <w:proofErr w:type="spellEnd"/>
+      <w:r>
+        <w:rPr>
+          <w:rFonts w:ascii="Times New Roman" w:eastAsia="Times New Roman" w:hAnsi="Times New Roman" w:cs="Times New Roman"/>
+          <w:b/>
+          <w:bCs/>
+          <w:sz w:val="27"/>
+          <w:szCs w:val="27"/>
+        </w:rPr>
+        <w:t>)</w:t>
+      </w:r>
+    </w:p>
+    <w:p>
+      <w:pPr>
+        <w:numPr>
+          <w:ilvl w:val="0"/>
+          <w:numId w:val="4"/>
+        </w:numPr>
+        <w:spacing w:before="100" w:beforeAutospacing="1" w:after="100" w:afterAutospacing="1" w:line="240" w:lineRule="auto"/>
+        <w:rPr>
+          <w:rFonts w:ascii="Times New Roman" w:eastAsia="Times New Roman" w:hAnsi="Times New Roman" w:cs="Times New Roman"/>
+          <w:sz w:val="24"/>
+          <w:szCs w:val="24"/>
+        </w:rPr>
+      </w:pPr>
+      <w:r>
+        <w:rPr>
+          <w:rFonts w:ascii="Times New Roman" w:eastAsia="Times New Roman" w:hAnsi="Times New Roman" w:cs="Times New Roman"/>
+          <w:b/>
+          <w:bCs/>
+          <w:sz w:val="24"/>
+          <w:szCs w:val="24"/>
+        </w:rPr>
+        <w:t>Official API Available:</w:t>
+      </w:r>
+      <w:r>
+        <w:rPr>
+          <w:rFonts w:ascii="Times New Roman" w:eastAsia="Times New Roman" w:hAnsi="Times New Roman" w:cs="Times New Roman"/>
+          <w:sz w:val="24"/>
+          <w:szCs w:val="24"/>
+        </w:rPr>
+        <w:t xml:space="preserve">  No</w:t>
+      </w:r>
+    </w:p>
+    <w:p>
+      <w:pPr>
+        <w:numPr>
+          <w:ilvl w:val="0"/>
+          <w:numId w:val="4"/>
+        </w:numPr>
+        <w:spacing w:before="100" w:beforeAutospacing="1" w:after="100" w:afterAutospacing="1" w:line="240" w:lineRule="auto"/>
+        <w:rPr>
+          <w:rFonts w:ascii="Times New Roman" w:eastAsia="Times New Roman" w:hAnsi="Times New Roman" w:cs="Times New Roman"/>
+          <w:sz w:val="24"/>
+          <w:szCs w:val="24"/>
+        </w:rPr>
+      </w:pPr>
+      <w:r>
+        <w:rPr>
+          <w:rFonts w:ascii="Times New Roman" w:eastAsia="Times New Roman" w:hAnsi="Times New Roman" w:cs="Times New Roman"/>
+          <w:b/>
+          <w:bCs/>
+          <w:sz w:val="24"/>
+          <w:szCs w:val="24"/>
+        </w:rPr>
+        <w:t>Tool Used:</w:t>
+      </w:r>
+    </w:p>
+    <w:p>
+      <w:pPr>
+        <w:numPr>
+          <w:ilvl w:val="1"/>
+          <w:numId w:val="4"/>
+        </w:numPr>
+        <w:spacing w:before="100" w:beforeAutospacing="1" w:after="100" w:afterAutospacing="1" w:line="240" w:lineRule="auto"/>
+        <w:rPr>
+          <w:rFonts w:ascii="Times New Roman" w:eastAsia="Times New Roman" w:hAnsi="Times New Roman" w:cs="Times New Roman"/>
+          <w:sz w:val="24"/>
+          <w:szCs w:val="24"/>
+        </w:rPr>
+      </w:pPr>
+      <w:proofErr w:type="spellStart"/>
+      <w:r>
+        <w:rPr>
+          <w:rFonts w:ascii="Times New Roman" w:eastAsia="Times New Roman" w:hAnsi="Times New Roman" w:cs="Times New Roman"/>
+          <w:b/>
+          <w:bCs/>
+          <w:sz w:val="24"/>
+          <w:szCs w:val="24"/>
+        </w:rPr>
+        <w:t>Apify</w:t>
+      </w:r>
+      <w:proofErr w:type="spellEnd"/>
+      <w:r>
+        <w:rPr>
+          <w:rFonts w:ascii="Times New Roman" w:eastAsia="Times New Roman" w:hAnsi="Times New Roman" w:cs="Times New Roman"/>
+          <w:b/>
+          <w:bCs/>
+          <w:sz w:val="24"/>
+          <w:szCs w:val="24"/>
+        </w:rPr>
+        <w:t xml:space="preserve"> – Generic Web Scraper</w:t>
+      </w:r>
+    </w:p>
+    <w:p>
+      <w:pPr>
+        <w:numPr>
+          <w:ilvl w:val="0"/>
+          <w:numId w:val="4"/>
+        </w:numPr>
+        <w:spacing w:before="100" w:beforeAutospacing="1" w:after="100" w:afterAutospacing="1" w:line="240" w:lineRule="auto"/>
+        <w:rPr>
+          <w:rFonts w:ascii="Times New Roman" w:eastAsia="Times New Roman" w:hAnsi="Times New Roman" w:cs="Times New Roman"/>
+          <w:sz w:val="24"/>
+          <w:szCs w:val="24"/>
+        </w:rPr>
+      </w:pPr>
+      <w:r>
+        <w:rPr>
+          <w:rFonts w:ascii="Times New Roman" w:eastAsia="Times New Roman" w:hAnsi="Times New Roman" w:cs="Times New Roman"/>
+          <w:b/>
+          <w:bCs/>
+          <w:sz w:val="24"/>
+          <w:szCs w:val="24"/>
+        </w:rPr>
+        <w:t>Data Available (Public):</w:t>
+      </w:r>
+    </w:p>
+    <w:p>
+      <w:pPr>
+        <w:numPr>
+          <w:ilvl w:val="1"/>
+          <w:numId w:val="4"/>
+        </w:numPr>
+        <w:spacing w:before="100" w:beforeAutospacing="1" w:after="100" w:afterAutospacing="1" w:line="240" w:lineRule="auto"/>
+        <w:rPr>
+          <w:rFonts w:ascii="Times New Roman" w:eastAsia="Times New Roman" w:hAnsi="Times New Roman" w:cs="Times New Roman"/>
+          <w:sz w:val="24"/>
+          <w:szCs w:val="24"/>
+        </w:rPr>
+      </w:pPr>
+      <w:r>
+        <w:rPr>
+          <w:rFonts w:ascii="Times New Roman" w:eastAsia="Times New Roman" w:hAnsi="Times New Roman" w:cs="Times New Roman"/>
+          <w:sz w:val="24"/>
+          <w:szCs w:val="24"/>
+        </w:rPr>
+        <w:lastRenderedPageBreak/>
+        <w:t>Messages</w:t>
+      </w:r>
+    </w:p>
+    <w:p>
+      <w:pPr>
+        <w:numPr>
+          <w:ilvl w:val="1"/>
+          <w:numId w:val="4"/>
+        </w:numPr>
+        <w:spacing w:before="100" w:beforeAutospacing="1" w:after="100" w:afterAutospacing="1" w:line="240" w:lineRule="auto"/>
+        <w:rPr>
+          <w:rFonts w:ascii="Times New Roman" w:eastAsia="Times New Roman" w:hAnsi="Times New Roman" w:cs="Times New Roman"/>
+          <w:sz w:val="24"/>
+          <w:szCs w:val="24"/>
+        </w:rPr>
+      </w:pPr>
+      <w:r>
+        <w:rPr>
+          <w:rFonts w:ascii="Times New Roman" w:eastAsia="Times New Roman" w:hAnsi="Times New Roman" w:cs="Times New Roman"/>
+          <w:sz w:val="24"/>
+          <w:szCs w:val="24"/>
+        </w:rPr>
+        <w:t>Reaction score</w:t>
+      </w:r>
+    </w:p>
+    <w:p>
+      <w:pPr>
+        <w:numPr>
+          <w:ilvl w:val="1"/>
+          <w:numId w:val="4"/>
+        </w:numPr>
+        <w:spacing w:before="100" w:beforeAutospacing="1" w:after="100" w:afterAutospacing="1" w:line="240" w:lineRule="auto"/>
+        <w:rPr>
+          <w:rFonts w:ascii="Times New Roman" w:eastAsia="Times New Roman" w:hAnsi="Times New Roman" w:cs="Times New Roman"/>
+          <w:sz w:val="24"/>
+          <w:szCs w:val="24"/>
+        </w:rPr>
+      </w:pPr>
+      <w:r>
+        <w:rPr>
+          <w:rFonts w:ascii="Times New Roman" w:eastAsia="Times New Roman" w:hAnsi="Times New Roman" w:cs="Times New Roman"/>
+          <w:sz w:val="24"/>
+          <w:szCs w:val="24"/>
+        </w:rPr>
+        <w:t>Points</w:t>
+      </w:r>
+    </w:p>
+    <w:p>
+      <w:pPr>
+        <w:numPr>
+          <w:ilvl w:val="1"/>
+          <w:numId w:val="4"/>
+        </w:numPr>
+        <w:spacing w:before="100" w:beforeAutospacing="1" w:after="100" w:afterAutospacing="1" w:line="240" w:lineRule="auto"/>
+        <w:rPr>
+          <w:rFonts w:ascii="Times New Roman" w:eastAsia="Times New Roman" w:hAnsi="Times New Roman" w:cs="Times New Roman"/>
+          <w:sz w:val="24"/>
+          <w:szCs w:val="24"/>
+        </w:rPr>
+      </w:pPr>
+      <w:r>
+        <w:rPr>
+          <w:rFonts w:ascii="Times New Roman" w:eastAsia="Times New Roman" w:hAnsi="Times New Roman" w:cs="Times New Roman"/>
+          <w:sz w:val="24"/>
+          <w:szCs w:val="24"/>
+        </w:rPr>
+        <w:t>Profile status</w:t>
+      </w:r>
+    </w:p>
+    <w:p>
+      <w:pPr>
+        <w:spacing w:before="100" w:beforeAutospacing="1" w:after="100" w:afterAutospacing="1" w:line="240" w:lineRule="auto"/>
+        <w:outlineLvl w:val="1"/>
+        <w:rPr>
+          <w:rFonts w:ascii="Times New Roman" w:eastAsia="Times New Roman" w:hAnsi="Times New Roman" w:cs="Times New Roman"/>
           <w:b/>
           <w:bCs/>
           <w:sz w:val="36"/>
           <w:szCs w:val="36"/>
         </w:rPr>
-        <w:t xml:space="preserve"> </w:t>
-      </w:r>
+      </w:pPr>
       <w:r>
         <w:rPr>
           <w:rFonts w:ascii="Times New Roman" w:eastAsia="Times New Roman" w:hAnsi="Times New Roman" w:cs="Times New Roman"/>
@@ -65,7 +1203,237 @@
           <w:sz w:val="36"/>
           <w:szCs w:val="36"/>
         </w:rPr>
-        <w:t>Platform-wise Official APIs &amp; Tools</w:t>
+        <w:t xml:space="preserve">2️ Why </w:t>
+      </w:r>
+      <w:proofErr w:type="spellStart"/>
+      <w:r>
+        <w:rPr>
+          <w:rFonts w:ascii="Times New Roman" w:eastAsia="Times New Roman" w:hAnsi="Times New Roman" w:cs="Times New Roman"/>
+          <w:b/>
+          <w:bCs/>
+          <w:sz w:val="36"/>
+          <w:szCs w:val="36"/>
+        </w:rPr>
+        <w:t>Apify</w:t>
+      </w:r>
+      <w:proofErr w:type="spellEnd"/>
+      <w:r>
+        <w:rPr>
+          <w:rFonts w:ascii="Times New Roman" w:eastAsia="Times New Roman" w:hAnsi="Times New Roman" w:cs="Times New Roman"/>
+          <w:b/>
+          <w:bCs/>
+          <w:sz w:val="36"/>
+          <w:szCs w:val="36"/>
+        </w:rPr>
+        <w:t xml:space="preserve"> Is Used</w:t>
+      </w:r>
+    </w:p>
+    <w:p>
+      <w:pPr>
+        <w:numPr>
+          <w:ilvl w:val="0"/>
+          <w:numId w:val="5"/>
+        </w:numPr>
+        <w:spacing w:before="100" w:beforeAutospacing="1" w:after="100" w:afterAutospacing="1" w:line="240" w:lineRule="auto"/>
+        <w:rPr>
+          <w:rFonts w:ascii="Times New Roman" w:eastAsia="Times New Roman" w:hAnsi="Times New Roman" w:cs="Times New Roman"/>
+          <w:sz w:val="24"/>
+          <w:szCs w:val="24"/>
+        </w:rPr>
+      </w:pPr>
+      <w:r>
+        <w:rPr>
+          <w:rFonts w:ascii="Times New Roman" w:eastAsia="Times New Roman" w:hAnsi="Times New Roman" w:cs="Times New Roman"/>
+          <w:sz w:val="24"/>
+          <w:szCs w:val="24"/>
+        </w:rPr>
+        <w:t>No login / no password sharing</w:t>
+      </w:r>
+    </w:p>
+    <w:p>
+      <w:pPr>
+        <w:numPr>
+          <w:ilvl w:val="0"/>
+          <w:numId w:val="5"/>
+        </w:numPr>
+        <w:spacing w:before="100" w:beforeAutospacing="1" w:after="100" w:afterAutospacing="1" w:line="240" w:lineRule="auto"/>
+        <w:rPr>
+          <w:rFonts w:ascii="Times New Roman" w:eastAsia="Times New Roman" w:hAnsi="Times New Roman" w:cs="Times New Roman"/>
+          <w:sz w:val="24"/>
+          <w:szCs w:val="24"/>
+        </w:rPr>
+      </w:pPr>
+      <w:r>
+        <w:rPr>
+          <w:rFonts w:ascii="Times New Roman" w:eastAsia="Times New Roman" w:hAnsi="Times New Roman" w:cs="Times New Roman"/>
+          <w:sz w:val="24"/>
+          <w:szCs w:val="24"/>
+        </w:rPr>
+        <w:t xml:space="preserve">Built-in </w:t>
+      </w:r>
+      <w:r>
+        <w:rPr>
+          <w:rFonts w:ascii="Times New Roman" w:eastAsia="Times New Roman" w:hAnsi="Times New Roman" w:cs="Times New Roman"/>
+          <w:b/>
+          <w:bCs/>
+          <w:sz w:val="24"/>
+          <w:szCs w:val="24"/>
+        </w:rPr>
+        <w:t>proxy rotation</w:t>
+      </w:r>
+      <w:r>
+        <w:rPr>
+          <w:rFonts w:ascii="Times New Roman" w:eastAsia="Times New Roman" w:hAnsi="Times New Roman" w:cs="Times New Roman"/>
+          <w:sz w:val="24"/>
+          <w:szCs w:val="24"/>
+        </w:rPr>
+        <w:t xml:space="preserve"> (residential proxies)</w:t>
+      </w:r>
+    </w:p>
+    <w:p>
+      <w:pPr>
+        <w:numPr>
+          <w:ilvl w:val="0"/>
+          <w:numId w:val="5"/>
+        </w:numPr>
+        <w:spacing w:before="100" w:beforeAutospacing="1" w:after="100" w:afterAutospacing="1" w:line="240" w:lineRule="auto"/>
+        <w:rPr>
+          <w:rFonts w:ascii="Times New Roman" w:eastAsia="Times New Roman" w:hAnsi="Times New Roman" w:cs="Times New Roman"/>
+          <w:sz w:val="24"/>
+          <w:szCs w:val="24"/>
+        </w:rPr>
+      </w:pPr>
+      <w:r>
+        <w:rPr>
+          <w:rFonts w:ascii="Times New Roman" w:eastAsia="Times New Roman" w:hAnsi="Times New Roman" w:cs="Times New Roman"/>
+          <w:sz w:val="24"/>
+          <w:szCs w:val="24"/>
+        </w:rPr>
+        <w:t>Handles IP bans &amp; retries automatically</w:t>
+      </w:r>
+    </w:p>
+    <w:p>
+      <w:pPr>
+        <w:numPr>
+          <w:ilvl w:val="0"/>
+          <w:numId w:val="5"/>
+        </w:numPr>
+        <w:spacing w:before="100" w:beforeAutospacing="1" w:after="100" w:afterAutospacing="1" w:line="240" w:lineRule="auto"/>
+        <w:rPr>
+          <w:rFonts w:ascii="Times New Roman" w:eastAsia="Times New Roman" w:hAnsi="Times New Roman" w:cs="Times New Roman"/>
+          <w:sz w:val="24"/>
+          <w:szCs w:val="24"/>
+        </w:rPr>
+      </w:pPr>
+      <w:r>
+        <w:rPr>
+          <w:rFonts w:ascii="Times New Roman" w:eastAsia="Times New Roman" w:hAnsi="Times New Roman" w:cs="Times New Roman"/>
+          <w:sz w:val="24"/>
+          <w:szCs w:val="24"/>
+        </w:rPr>
+        <w:t>Low maintenance</w:t>
+      </w:r>
+    </w:p>
+    <w:p>
+      <w:pPr>
+        <w:numPr>
+          <w:ilvl w:val="0"/>
+          <w:numId w:val="5"/>
+        </w:numPr>
+        <w:spacing w:before="100" w:beforeAutospacing="1" w:after="100" w:afterAutospacing="1" w:line="240" w:lineRule="auto"/>
+        <w:rPr>
+          <w:rFonts w:ascii="Times New Roman" w:eastAsia="Times New Roman" w:hAnsi="Times New Roman" w:cs="Times New Roman"/>
+          <w:sz w:val="24"/>
+          <w:szCs w:val="24"/>
+        </w:rPr>
+      </w:pPr>
+      <w:r>
+        <w:rPr>
+          <w:rFonts w:ascii="Times New Roman" w:eastAsia="Times New Roman" w:hAnsi="Times New Roman" w:cs="Times New Roman"/>
+          <w:sz w:val="24"/>
+          <w:szCs w:val="24"/>
+        </w:rPr>
+        <w:t>Scales easily to 600+ profiles</w:t>
+      </w:r>
+    </w:p>
+    <w:p>
+      <w:pPr>
+        <w:numPr>
+          <w:ilvl w:val="0"/>
+          <w:numId w:val="5"/>
+        </w:numPr>
+        <w:spacing w:before="100" w:beforeAutospacing="1" w:after="100" w:afterAutospacing="1" w:line="240" w:lineRule="auto"/>
+        <w:rPr>
+          <w:rFonts w:ascii="Times New Roman" w:eastAsia="Times New Roman" w:hAnsi="Times New Roman" w:cs="Times New Roman"/>
+          <w:sz w:val="24"/>
+          <w:szCs w:val="24"/>
+        </w:rPr>
+      </w:pPr>
+      <w:r>
+        <w:rPr>
+          <w:rFonts w:ascii="Times New Roman" w:eastAsia="Times New Roman" w:hAnsi="Times New Roman" w:cs="Times New Roman"/>
+          <w:sz w:val="24"/>
+          <w:szCs w:val="24"/>
+        </w:rPr>
+        <w:t>Much safer than headless browsers or custom bots</w:t>
+      </w:r>
+    </w:p>
+    <w:p>
+      <w:pPr>
+        <w:spacing w:before="100" w:beforeAutospacing="1" w:after="100" w:afterAutospacing="1" w:line="240" w:lineRule="auto"/>
+        <w:ind w:left="720"/>
+        <w:rPr>
+          <w:rFonts w:ascii="Times New Roman" w:eastAsia="Times New Roman" w:hAnsi="Times New Roman" w:cs="Times New Roman"/>
+          <w:sz w:val="24"/>
+          <w:szCs w:val="24"/>
+        </w:rPr>
+      </w:pPr>
+      <w:proofErr w:type="gramStart"/>
+      <w:r>
+        <w:rPr>
+          <w:rFonts w:ascii="Times New Roman" w:eastAsia="Times New Roman" w:hAnsi="Times New Roman" w:cs="Times New Roman"/>
+          <w:sz w:val="24"/>
+          <w:szCs w:val="24"/>
+        </w:rPr>
+        <w:t>Note :</w:t>
+      </w:r>
+      <w:proofErr w:type="gramEnd"/>
+      <w:r>
+        <w:rPr>
+          <w:rFonts w:ascii="Times New Roman" w:eastAsia="Times New Roman" w:hAnsi="Times New Roman" w:cs="Times New Roman"/>
+          <w:sz w:val="24"/>
+          <w:szCs w:val="24"/>
+        </w:rPr>
+        <w:t xml:space="preserve"> </w:t>
+      </w:r>
+      <w:r>
+        <w:rPr>
+          <w:rFonts w:ascii="Times New Roman" w:hAnsi="Times New Roman" w:cs="Times New Roman"/>
+        </w:rPr>
+        <w:t>Data is Observational, Not Authoritative</w:t>
+      </w:r>
+    </w:p>
+    <w:p>
+      <w:pPr>
+        <w:spacing w:before="100" w:beforeAutospacing="1" w:after="100" w:afterAutospacing="1" w:line="240" w:lineRule="auto"/>
+        <w:outlineLvl w:val="1"/>
+        <w:rPr>
+          <w:rFonts w:ascii="Times New Roman" w:eastAsia="Times New Roman" w:hAnsi="Times New Roman" w:cs="Times New Roman"/>
+          <w:b/>
+          <w:bCs/>
+          <w:sz w:val="36"/>
+          <w:szCs w:val="36"/>
+        </w:rPr>
+      </w:pPr>
+      <w:r>
+        <w:rPr>
+          <w:rFonts w:ascii="Times New Roman" w:eastAsia="Times New Roman" w:hAnsi="Times New Roman" w:cs="Times New Roman"/>
+          <w:b/>
+          <w:bCs/>
+          <w:sz w:val="36"/>
+          <w:szCs w:val="36"/>
+        </w:rPr>
+        <w:t>3️ Cost Estimation (Monthly)</w:t>
       </w:r>
     </w:p>
     <w:p>
@@ -80,7 +1448,6 @@
           <w:szCs w:val="27"/>
         </w:rPr>
       </w:pPr>
-      <w:proofErr w:type="spellStart"/>
       <w:r>
         <w:rPr>
           <w:rFonts w:ascii="Times New Roman" w:eastAsia="Times New Roman" w:hAnsi="Times New Roman" w:cs="Times New Roman"/>
@@ -89,239 +1456,100 @@
           <w:sz w:val="27"/>
           <w:szCs w:val="27"/>
         </w:rPr>
+        <w:t>If run once per day:</w:t>
+      </w:r>
+    </w:p>
+    <w:p>
+      <w:pPr>
+        <w:numPr>
+          <w:ilvl w:val="0"/>
+          <w:numId w:val="6"/>
+        </w:numPr>
+        <w:spacing w:before="100" w:beforeAutospacing="1" w:after="100" w:afterAutospacing="1" w:line="240" w:lineRule="auto"/>
+        <w:rPr>
+          <w:rFonts w:ascii="Times New Roman" w:eastAsia="Times New Roman" w:hAnsi="Times New Roman" w:cs="Times New Roman"/>
+          <w:sz w:val="24"/>
+          <w:szCs w:val="24"/>
+        </w:rPr>
+      </w:pPr>
+      <w:proofErr w:type="spellStart"/>
+      <w:r>
+        <w:rPr>
+          <w:rFonts w:ascii="Times New Roman" w:eastAsia="Times New Roman" w:hAnsi="Times New Roman" w:cs="Times New Roman"/>
+          <w:sz w:val="24"/>
+          <w:szCs w:val="24"/>
+        </w:rPr>
         <w:t>Instagram</w:t>
       </w:r>
       <w:proofErr w:type="spellEnd"/>
+      <w:r>
+        <w:rPr>
+          <w:rFonts w:ascii="Times New Roman" w:eastAsia="Times New Roman" w:hAnsi="Times New Roman" w:cs="Times New Roman"/>
+          <w:sz w:val="24"/>
+          <w:szCs w:val="24"/>
+        </w:rPr>
+        <w:t xml:space="preserve"> (100): ~$2</w:t>
+      </w:r>
     </w:p>
     <w:p>
       <w:pPr>
         <w:numPr>
           <w:ilvl w:val="0"/>
-          <w:numId w:val="1"/>
-        </w:numPr>
-        <w:spacing w:before="100" w:beforeAutospacing="1" w:after="100" w:afterAutospacing="1" w:line="240" w:lineRule="auto"/>
-        <w:rPr>
-          <w:rFonts w:ascii="Times New Roman" w:eastAsia="Times New Roman" w:hAnsi="Times New Roman" w:cs="Times New Roman"/>
-          <w:sz w:val="24"/>
-          <w:szCs w:val="24"/>
-        </w:rPr>
-      </w:pPr>
-      <w:r>
-        <w:rPr>
-          <w:rFonts w:ascii="Times New Roman" w:eastAsia="Times New Roman" w:hAnsi="Times New Roman" w:cs="Times New Roman"/>
-          <w:b/>
-          <w:bCs/>
-          <w:sz w:val="24"/>
-          <w:szCs w:val="24"/>
-        </w:rPr>
-        <w:t>Official API Available:</w:t>
-      </w:r>
-      <w:r>
-        <w:rPr>
-          <w:rFonts w:ascii="Times New Roman" w:eastAsia="Times New Roman" w:hAnsi="Times New Roman" w:cs="Times New Roman"/>
-          <w:sz w:val="24"/>
-          <w:szCs w:val="24"/>
-        </w:rPr>
-        <w:t xml:space="preserve">  Yes</w:t>
-      </w:r>
-    </w:p>
-    <w:p>
-      <w:pPr>
-        <w:numPr>
-          <w:ilvl w:val="1"/>
-          <w:numId w:val="1"/>
-        </w:numPr>
-        <w:spacing w:before="100" w:beforeAutospacing="1" w:after="100" w:afterAutospacing="1" w:line="240" w:lineRule="auto"/>
-        <w:rPr>
-          <w:rFonts w:ascii="Times New Roman" w:eastAsia="Times New Roman" w:hAnsi="Times New Roman" w:cs="Times New Roman"/>
-          <w:sz w:val="24"/>
-          <w:szCs w:val="24"/>
-        </w:rPr>
-      </w:pPr>
-      <w:r>
-        <w:rPr>
-          <w:rFonts w:ascii="Times New Roman" w:eastAsia="Times New Roman" w:hAnsi="Times New Roman" w:cs="Times New Roman"/>
-          <w:b/>
-          <w:bCs/>
-          <w:sz w:val="24"/>
-          <w:szCs w:val="24"/>
-        </w:rPr>
-        <w:t xml:space="preserve">Meta </w:t>
-      </w:r>
+          <w:numId w:val="6"/>
+        </w:numPr>
+        <w:spacing w:before="100" w:beforeAutospacing="1" w:after="100" w:afterAutospacing="1" w:line="240" w:lineRule="auto"/>
+        <w:rPr>
+          <w:rFonts w:ascii="Times New Roman" w:eastAsia="Times New Roman" w:hAnsi="Times New Roman" w:cs="Times New Roman"/>
+          <w:sz w:val="24"/>
+          <w:szCs w:val="24"/>
+        </w:rPr>
+      </w:pPr>
       <w:proofErr w:type="spellStart"/>
       <w:r>
         <w:rPr>
           <w:rFonts w:ascii="Times New Roman" w:eastAsia="Times New Roman" w:hAnsi="Times New Roman" w:cs="Times New Roman"/>
-          <w:b/>
-          <w:bCs/>
-          <w:sz w:val="24"/>
-          <w:szCs w:val="24"/>
-        </w:rPr>
-        <w:t>Instagram</w:t>
+          <w:sz w:val="24"/>
+          <w:szCs w:val="24"/>
+        </w:rPr>
+        <w:t>Quora</w:t>
       </w:r>
       <w:proofErr w:type="spellEnd"/>
       <w:r>
         <w:rPr>
           <w:rFonts w:ascii="Times New Roman" w:eastAsia="Times New Roman" w:hAnsi="Times New Roman" w:cs="Times New Roman"/>
-          <w:b/>
-          <w:bCs/>
-          <w:sz w:val="24"/>
-          <w:szCs w:val="24"/>
-        </w:rPr>
-        <w:t xml:space="preserve"> Graph API</w:t>
-      </w:r>
-    </w:p>
-    <w:p>
-      <w:pPr>
-        <w:numPr>
-          <w:ilvl w:val="1"/>
-          <w:numId w:val="1"/>
-        </w:numPr>
-        <w:spacing w:before="100" w:beforeAutospacing="1" w:after="100" w:afterAutospacing="1" w:line="240" w:lineRule="auto"/>
-        <w:rPr>
-          <w:rFonts w:ascii="Times New Roman" w:eastAsia="Times New Roman" w:hAnsi="Times New Roman" w:cs="Times New Roman"/>
-          <w:sz w:val="24"/>
-          <w:szCs w:val="24"/>
-        </w:rPr>
-      </w:pPr>
-      <w:r>
-        <w:rPr>
-          <w:rFonts w:ascii="Times New Roman" w:eastAsia="Times New Roman" w:hAnsi="Times New Roman" w:cs="Times New Roman"/>
-          <w:sz w:val="24"/>
-          <w:szCs w:val="24"/>
-        </w:rPr>
-        <w:t xml:space="preserve">Works </w:t>
-      </w:r>
-      <w:r>
-        <w:rPr>
-          <w:rFonts w:ascii="Times New Roman" w:eastAsia="Times New Roman" w:hAnsi="Times New Roman" w:cs="Times New Roman"/>
-          <w:b/>
-          <w:bCs/>
-          <w:sz w:val="24"/>
-          <w:szCs w:val="24"/>
-        </w:rPr>
-        <w:t>only for Creator / Business accounts</w:t>
+          <w:sz w:val="24"/>
+          <w:szCs w:val="24"/>
+        </w:rPr>
+        <w:t xml:space="preserve"> (200): ~$2.5</w:t>
       </w:r>
     </w:p>
     <w:p>
       <w:pPr>
         <w:numPr>
           <w:ilvl w:val="0"/>
-          <w:numId w:val="1"/>
-        </w:numPr>
-        <w:spacing w:before="100" w:beforeAutospacing="1" w:after="100" w:afterAutospacing="1" w:line="240" w:lineRule="auto"/>
-        <w:rPr>
-          <w:rFonts w:ascii="Times New Roman" w:eastAsia="Times New Roman" w:hAnsi="Times New Roman" w:cs="Times New Roman"/>
-          <w:sz w:val="24"/>
-          <w:szCs w:val="24"/>
-        </w:rPr>
-      </w:pPr>
-      <w:r>
-        <w:rPr>
-          <w:rFonts w:ascii="Times New Roman" w:eastAsia="Times New Roman" w:hAnsi="Times New Roman" w:cs="Times New Roman"/>
-          <w:b/>
-          <w:bCs/>
-          <w:sz w:val="24"/>
-          <w:szCs w:val="24"/>
-        </w:rPr>
-        <w:t>Limitations:</w:t>
-      </w:r>
-    </w:p>
-    <w:p>
-      <w:pPr>
-        <w:numPr>
-          <w:ilvl w:val="1"/>
-          <w:numId w:val="1"/>
-        </w:numPr>
-        <w:spacing w:before="100" w:beforeAutospacing="1" w:after="100" w:afterAutospacing="1" w:line="240" w:lineRule="auto"/>
-        <w:rPr>
-          <w:rFonts w:ascii="Times New Roman" w:eastAsia="Times New Roman" w:hAnsi="Times New Roman" w:cs="Times New Roman"/>
-          <w:sz w:val="24"/>
-          <w:szCs w:val="24"/>
-        </w:rPr>
-      </w:pPr>
-      <w:r>
-        <w:rPr>
-          <w:rFonts w:ascii="Times New Roman" w:eastAsia="Times New Roman" w:hAnsi="Times New Roman" w:cs="Times New Roman"/>
-          <w:sz w:val="24"/>
-          <w:szCs w:val="24"/>
-        </w:rPr>
-        <w:t xml:space="preserve"> No profile visits</w:t>
-      </w:r>
-    </w:p>
-    <w:p>
-      <w:pPr>
-        <w:numPr>
-          <w:ilvl w:val="1"/>
-          <w:numId w:val="1"/>
-        </w:numPr>
-        <w:spacing w:before="100" w:beforeAutospacing="1" w:after="100" w:afterAutospacing="1" w:line="240" w:lineRule="auto"/>
-        <w:rPr>
-          <w:rFonts w:ascii="Times New Roman" w:eastAsia="Times New Roman" w:hAnsi="Times New Roman" w:cs="Times New Roman"/>
-          <w:sz w:val="24"/>
-          <w:szCs w:val="24"/>
-        </w:rPr>
-      </w:pPr>
-      <w:r>
-        <w:rPr>
-          <w:rFonts w:ascii="Times New Roman" w:eastAsia="Times New Roman" w:hAnsi="Times New Roman" w:cs="Times New Roman"/>
-          <w:sz w:val="24"/>
-          <w:szCs w:val="24"/>
-        </w:rPr>
-        <w:t xml:space="preserve"> No link taps</w:t>
-      </w:r>
-    </w:p>
-    <w:p>
-      <w:pPr>
-        <w:numPr>
-          <w:ilvl w:val="1"/>
-          <w:numId w:val="1"/>
-        </w:numPr>
-        <w:spacing w:before="100" w:beforeAutospacing="1" w:after="100" w:afterAutospacing="1" w:line="240" w:lineRule="auto"/>
-        <w:rPr>
-          <w:rFonts w:ascii="Times New Roman" w:eastAsia="Times New Roman" w:hAnsi="Times New Roman" w:cs="Times New Roman"/>
-          <w:sz w:val="24"/>
-          <w:szCs w:val="24"/>
-        </w:rPr>
-      </w:pPr>
-      <w:r>
-        <w:rPr>
-          <w:rFonts w:ascii="Times New Roman" w:eastAsia="Times New Roman" w:hAnsi="Times New Roman" w:cs="Times New Roman"/>
-          <w:sz w:val="24"/>
-          <w:szCs w:val="24"/>
-        </w:rPr>
-        <w:t xml:space="preserve"> No following count</w:t>
+          <w:numId w:val="6"/>
+        </w:numPr>
+        <w:spacing w:before="100" w:beforeAutospacing="1" w:after="100" w:afterAutospacing="1" w:line="240" w:lineRule="auto"/>
+        <w:rPr>
+          <w:rFonts w:ascii="Times New Roman" w:eastAsia="Times New Roman" w:hAnsi="Times New Roman" w:cs="Times New Roman"/>
+          <w:sz w:val="24"/>
+          <w:szCs w:val="24"/>
+        </w:rPr>
+      </w:pPr>
+      <w:r>
+        <w:rPr>
+          <w:rFonts w:ascii="Times New Roman" w:eastAsia="Times New Roman" w:hAnsi="Times New Roman" w:cs="Times New Roman"/>
+          <w:sz w:val="24"/>
+          <w:szCs w:val="24"/>
+        </w:rPr>
+        <w:t>BHW (100): ~$5</w:t>
       </w:r>
     </w:p>
     <w:p>
       <w:pPr>
         <w:numPr>
           <w:ilvl w:val="0"/>
-          <w:numId w:val="1"/>
-        </w:numPr>
-        <w:spacing w:before="100" w:beforeAutospacing="1" w:after="100" w:afterAutospacing="1" w:line="240" w:lineRule="auto"/>
-        <w:rPr>
-          <w:rFonts w:ascii="Times New Roman" w:eastAsia="Times New Roman" w:hAnsi="Times New Roman" w:cs="Times New Roman"/>
-          <w:sz w:val="24"/>
-          <w:szCs w:val="24"/>
-        </w:rPr>
-      </w:pPr>
-      <w:r>
-        <w:rPr>
-          <w:rFonts w:ascii="Times New Roman" w:eastAsia="Times New Roman" w:hAnsi="Times New Roman" w:cs="Times New Roman"/>
-          <w:b/>
-          <w:bCs/>
-          <w:sz w:val="24"/>
-          <w:szCs w:val="24"/>
-        </w:rPr>
-        <w:t>Tool Used:</w:t>
-      </w:r>
-    </w:p>
-    <w:p>
-      <w:pPr>
-        <w:numPr>
-          <w:ilvl w:val="1"/>
-          <w:numId w:val="1"/>
+          <w:numId w:val="6"/>
         </w:numPr>
         <w:spacing w:before="100" w:beforeAutospacing="1" w:after="100" w:afterAutospacing="1" w:line="240" w:lineRule="auto"/>
         <w:rPr>
@@ -334,53 +1562,61 @@
       <w:r>
         <w:rPr>
           <w:rFonts w:ascii="Times New Roman" w:eastAsia="Times New Roman" w:hAnsi="Times New Roman" w:cs="Times New Roman"/>
-          <w:b/>
-          <w:bCs/>
-          <w:sz w:val="24"/>
-          <w:szCs w:val="24"/>
-        </w:rPr>
-        <w:t>Apify</w:t>
+          <w:sz w:val="24"/>
+          <w:szCs w:val="24"/>
+        </w:rPr>
+        <w:t>Reddit</w:t>
       </w:r>
       <w:proofErr w:type="spellEnd"/>
       <w:r>
         <w:rPr>
           <w:rFonts w:ascii="Times New Roman" w:eastAsia="Times New Roman" w:hAnsi="Times New Roman" w:cs="Times New Roman"/>
-          <w:b/>
-          <w:bCs/>
-          <w:sz w:val="24"/>
-          <w:szCs w:val="24"/>
-        </w:rPr>
-        <w:t xml:space="preserve"> – </w:t>
-      </w:r>
-      <w:proofErr w:type="spellStart"/>
-      <w:r>
-        <w:rPr>
-          <w:rFonts w:ascii="Times New Roman" w:eastAsia="Times New Roman" w:hAnsi="Times New Roman" w:cs="Times New Roman"/>
-          <w:b/>
-          <w:bCs/>
-          <w:sz w:val="24"/>
-          <w:szCs w:val="24"/>
-        </w:rPr>
-        <w:t>Instagram</w:t>
-      </w:r>
-      <w:proofErr w:type="spellEnd"/>
-      <w:r>
-        <w:rPr>
-          <w:rFonts w:ascii="Times New Roman" w:eastAsia="Times New Roman" w:hAnsi="Times New Roman" w:cs="Times New Roman"/>
-          <w:b/>
-          <w:bCs/>
-          <w:sz w:val="24"/>
-          <w:szCs w:val="24"/>
-        </w:rPr>
-        <w:t xml:space="preserve"> Profile Scraper (No Login)</w:t>
-      </w:r>
-      <w:r>
-        <w:rPr>
-          <w:rFonts w:ascii="Times New Roman" w:eastAsia="Times New Roman" w:hAnsi="Times New Roman" w:cs="Times New Roman"/>
-          <w:sz w:val="24"/>
-          <w:szCs w:val="24"/>
-        </w:rPr>
-        <w:t xml:space="preserve"> for public stats</w:t>
+          <w:sz w:val="24"/>
+          <w:szCs w:val="24"/>
+        </w:rPr>
+        <w:t xml:space="preserve"> (200): $0</w:t>
+      </w:r>
+    </w:p>
+    <w:p>
+      <w:pPr>
+        <w:numPr>
+          <w:ilvl w:val="0"/>
+          <w:numId w:val="6"/>
+        </w:numPr>
+        <w:spacing w:before="100" w:beforeAutospacing="1" w:after="100" w:afterAutospacing="1" w:line="240" w:lineRule="auto"/>
+        <w:rPr>
+          <w:rFonts w:ascii="Times New Roman" w:eastAsia="Times New Roman" w:hAnsi="Times New Roman" w:cs="Times New Roman"/>
+          <w:sz w:val="24"/>
+          <w:szCs w:val="24"/>
+        </w:rPr>
+      </w:pPr>
+      <w:r>
+        <w:rPr>
+          <w:rFonts w:ascii="Times New Roman" w:eastAsia="Times New Roman" w:hAnsi="Times New Roman" w:cs="Times New Roman"/>
+          <w:b/>
+          <w:bCs/>
+          <w:sz w:val="24"/>
+          <w:szCs w:val="24"/>
+        </w:rPr>
+        <w:t>Total:</w:t>
+      </w:r>
+      <w:r>
+        <w:rPr>
+          <w:rFonts w:ascii="Times New Roman" w:eastAsia="Times New Roman" w:hAnsi="Times New Roman" w:cs="Times New Roman"/>
+          <w:sz w:val="24"/>
+          <w:szCs w:val="24"/>
+        </w:rPr>
+        <w:t xml:space="preserve"> </w:t>
+      </w:r>
+      <w:r>
+        <w:rPr>
+          <w:rFonts w:ascii="Times New Roman" w:eastAsia="Times New Roman" w:hAnsi="Times New Roman" w:cs="Times New Roman"/>
+          <w:b/>
+          <w:bCs/>
+          <w:sz w:val="24"/>
+          <w:szCs w:val="24"/>
+        </w:rPr>
+        <w:t>~$10–12 / month</w:t>
       </w:r>
     </w:p>
     <w:p>
@@ -395,7 +1631,6 @@
           <w:szCs w:val="27"/>
         </w:rPr>
       </w:pPr>
-      <w:proofErr w:type="spellStart"/>
       <w:r>
         <w:rPr>
           <w:rFonts w:ascii="Times New Roman" w:eastAsia="Times New Roman" w:hAnsi="Times New Roman" w:cs="Times New Roman"/>
@@ -404,47 +1639,46 @@
           <w:sz w:val="27"/>
           <w:szCs w:val="27"/>
         </w:rPr>
-        <w:t>Reddit</w:t>
+        <w:t>Recommended safer schedule:</w:t>
+      </w:r>
+    </w:p>
+    <w:p>
+      <w:pPr>
+        <w:numPr>
+          <w:ilvl w:val="0"/>
+          <w:numId w:val="7"/>
+        </w:numPr>
+        <w:spacing w:before="100" w:beforeAutospacing="1" w:after="100" w:afterAutospacing="1" w:line="240" w:lineRule="auto"/>
+        <w:rPr>
+          <w:rFonts w:ascii="Times New Roman" w:eastAsia="Times New Roman" w:hAnsi="Times New Roman" w:cs="Times New Roman"/>
+          <w:sz w:val="24"/>
+          <w:szCs w:val="24"/>
+        </w:rPr>
+      </w:pPr>
+      <w:proofErr w:type="spellStart"/>
+      <w:r>
+        <w:rPr>
+          <w:rFonts w:ascii="Times New Roman" w:eastAsia="Times New Roman" w:hAnsi="Times New Roman" w:cs="Times New Roman"/>
+          <w:sz w:val="24"/>
+          <w:szCs w:val="24"/>
+        </w:rPr>
+        <w:t>Instagram</w:t>
       </w:r>
       <w:proofErr w:type="spellEnd"/>
+      <w:r>
+        <w:rPr>
+          <w:rFonts w:ascii="Times New Roman" w:eastAsia="Times New Roman" w:hAnsi="Times New Roman" w:cs="Times New Roman"/>
+          <w:sz w:val="24"/>
+          <w:szCs w:val="24"/>
+        </w:rPr>
+        <w:t>: every 48 hours</w:t>
+      </w:r>
     </w:p>
     <w:p>
       <w:pPr>
         <w:numPr>
           <w:ilvl w:val="0"/>
-          <w:numId w:val="2"/>
-        </w:numPr>
-        <w:spacing w:before="100" w:beforeAutospacing="1" w:after="100" w:afterAutospacing="1" w:line="240" w:lineRule="auto"/>
-        <w:rPr>
-          <w:rFonts w:ascii="Times New Roman" w:eastAsia="Times New Roman" w:hAnsi="Times New Roman" w:cs="Times New Roman"/>
-          <w:sz w:val="24"/>
-          <w:szCs w:val="24"/>
-        </w:rPr>
-      </w:pPr>
-      <w:r>
-        <w:rPr>
-          <w:rFonts w:ascii="Times New Roman" w:eastAsia="Times New Roman" w:hAnsi="Times New Roman" w:cs="Times New Roman"/>
-          <w:b/>
-          <w:bCs/>
-          <w:sz w:val="24"/>
-          <w:szCs w:val="24"/>
-        </w:rPr>
-        <w:t>Official API Available:</w:t>
-      </w:r>
-      <w:r>
-        <w:rPr>
-          <w:rFonts w:ascii="Times New Roman" w:eastAsia="Times New Roman" w:hAnsi="Times New Roman" w:cs="Times New Roman"/>
-          <w:sz w:val="24"/>
-          <w:szCs w:val="24"/>
-        </w:rPr>
-        <w:t xml:space="preserve">  Yes</w:t>
-      </w:r>
-    </w:p>
-    <w:p>
-      <w:pPr>
-        <w:numPr>
-          <w:ilvl w:val="1"/>
-          <w:numId w:val="2"/>
+          <w:numId w:val="7"/>
         </w:numPr>
         <w:spacing w:before="100" w:beforeAutospacing="1" w:after="100" w:afterAutospacing="1" w:line="240" w:lineRule="auto"/>
         <w:rPr>
@@ -460,7 +1694,7 @@
           <w:sz w:val="24"/>
           <w:szCs w:val="24"/>
         </w:rPr>
-        <w:t>Reddit</w:t>
+        <w:t>Quora</w:t>
       </w:r>
       <w:proofErr w:type="spellEnd"/>
       <w:r>
@@ -469,739 +1703,32 @@
           <w:sz w:val="24"/>
           <w:szCs w:val="24"/>
         </w:rPr>
-        <w:t xml:space="preserve"> </w:t>
-      </w:r>
-      <w:proofErr w:type="spellStart"/>
-      <w:r>
-        <w:rPr>
-          <w:rFonts w:ascii="Times New Roman" w:eastAsia="Times New Roman" w:hAnsi="Times New Roman" w:cs="Times New Roman"/>
-          <w:sz w:val="24"/>
-          <w:szCs w:val="24"/>
-        </w:rPr>
-        <w:t>OAuth</w:t>
-      </w:r>
-      <w:proofErr w:type="spellEnd"/>
-      <w:r>
-        <w:rPr>
-          <w:rFonts w:ascii="Times New Roman" w:eastAsia="Times New Roman" w:hAnsi="Times New Roman" w:cs="Times New Roman"/>
-          <w:sz w:val="24"/>
-          <w:szCs w:val="24"/>
-        </w:rPr>
-        <w:t xml:space="preserve"> API (posts, comments, activity)</w:t>
+        <w:t>: weekly</w:t>
       </w:r>
     </w:p>
     <w:p>
       <w:pPr>
         <w:numPr>
           <w:ilvl w:val="0"/>
-          <w:numId w:val="2"/>
-        </w:numPr>
-        <w:spacing w:before="100" w:beforeAutospacing="1" w:after="100" w:afterAutospacing="1" w:line="240" w:lineRule="auto"/>
-        <w:rPr>
-          <w:rFonts w:ascii="Times New Roman" w:eastAsia="Times New Roman" w:hAnsi="Times New Roman" w:cs="Times New Roman"/>
-          <w:sz w:val="24"/>
-          <w:szCs w:val="24"/>
-        </w:rPr>
-      </w:pPr>
-      <w:r>
-        <w:rPr>
-          <w:rFonts w:ascii="Times New Roman" w:eastAsia="Times New Roman" w:hAnsi="Times New Roman" w:cs="Times New Roman"/>
-          <w:b/>
-          <w:bCs/>
-          <w:sz w:val="24"/>
-          <w:szCs w:val="24"/>
-        </w:rPr>
-        <w:t>Fallback (Public):</w:t>
-      </w:r>
-    </w:p>
-    <w:p>
-      <w:pPr>
-        <w:numPr>
-          <w:ilvl w:val="1"/>
-          <w:numId w:val="2"/>
-        </w:numPr>
-        <w:spacing w:before="100" w:beforeAutospacing="1" w:after="100" w:afterAutospacing="1" w:line="240" w:lineRule="auto"/>
-        <w:rPr>
-          <w:rFonts w:ascii="Times New Roman" w:eastAsia="Times New Roman" w:hAnsi="Times New Roman" w:cs="Times New Roman"/>
-          <w:sz w:val="24"/>
-          <w:szCs w:val="24"/>
-        </w:rPr>
-      </w:pPr>
-      <w:r>
-        <w:rPr>
-          <w:rFonts w:ascii="Courier New" w:eastAsia="Times New Roman" w:hAnsi="Courier New" w:cs="Courier New"/>
-          <w:sz w:val="20"/>
-          <w:szCs w:val="20"/>
-        </w:rPr>
-        <w:t>/user/{username}/.</w:t>
-      </w:r>
-      <w:proofErr w:type="spellStart"/>
-      <w:r>
-        <w:rPr>
-          <w:rFonts w:ascii="Courier New" w:eastAsia="Times New Roman" w:hAnsi="Courier New" w:cs="Courier New"/>
-          <w:sz w:val="20"/>
-          <w:szCs w:val="20"/>
-        </w:rPr>
-        <w:t>json</w:t>
-      </w:r>
-      <w:proofErr w:type="spellEnd"/>
-      <w:r>
-        <w:rPr>
-          <w:rFonts w:ascii="Times New Roman" w:eastAsia="Times New Roman" w:hAnsi="Times New Roman" w:cs="Times New Roman"/>
-          <w:sz w:val="24"/>
-          <w:szCs w:val="24"/>
-        </w:rPr>
-        <w:t xml:space="preserve"> (no login)</w:t>
-      </w:r>
-    </w:p>
-    <w:p>
-      <w:pPr>
-        <w:numPr>
-          <w:ilvl w:val="0"/>
-          <w:numId w:val="2"/>
-        </w:numPr>
-        <w:spacing w:before="100" w:beforeAutospacing="1" w:after="100" w:afterAutospacing="1" w:line="240" w:lineRule="auto"/>
-        <w:rPr>
-          <w:rFonts w:ascii="Times New Roman" w:eastAsia="Times New Roman" w:hAnsi="Times New Roman" w:cs="Times New Roman"/>
-          <w:sz w:val="24"/>
-          <w:szCs w:val="24"/>
-        </w:rPr>
-      </w:pPr>
-      <w:r>
-        <w:rPr>
-          <w:rFonts w:ascii="Times New Roman" w:eastAsia="Times New Roman" w:hAnsi="Times New Roman" w:cs="Times New Roman"/>
-          <w:b/>
-          <w:bCs/>
-          <w:sz w:val="24"/>
-          <w:szCs w:val="24"/>
-        </w:rPr>
-        <w:t>Data Available:</w:t>
-      </w:r>
-    </w:p>
-    <w:p>
-      <w:pPr>
-        <w:numPr>
-          <w:ilvl w:val="1"/>
-          <w:numId w:val="2"/>
-        </w:numPr>
-        <w:spacing w:before="100" w:beforeAutospacing="1" w:after="100" w:afterAutospacing="1" w:line="240" w:lineRule="auto"/>
-        <w:rPr>
-          <w:rFonts w:ascii="Times New Roman" w:eastAsia="Times New Roman" w:hAnsi="Times New Roman" w:cs="Times New Roman"/>
-          <w:sz w:val="24"/>
-          <w:szCs w:val="24"/>
-        </w:rPr>
-      </w:pPr>
-      <w:r>
-        <w:rPr>
-          <w:rFonts w:ascii="Times New Roman" w:eastAsia="Times New Roman" w:hAnsi="Times New Roman" w:cs="Times New Roman"/>
-          <w:sz w:val="24"/>
-          <w:szCs w:val="24"/>
-        </w:rPr>
-        <w:t>Posts, comments, timestamps, engagement</w:t>
-      </w:r>
-    </w:p>
-    <w:p>
-      <w:pPr>
-        <w:numPr>
-          <w:ilvl w:val="0"/>
-          <w:numId w:val="2"/>
-        </w:numPr>
-        <w:spacing w:before="100" w:beforeAutospacing="1" w:after="100" w:afterAutospacing="1" w:line="240" w:lineRule="auto"/>
-        <w:rPr>
-          <w:rFonts w:ascii="Times New Roman" w:eastAsia="Times New Roman" w:hAnsi="Times New Roman" w:cs="Times New Roman"/>
-          <w:sz w:val="24"/>
-          <w:szCs w:val="24"/>
-        </w:rPr>
-      </w:pPr>
-      <w:r>
-        <w:rPr>
-          <w:rFonts w:ascii="Times New Roman" w:eastAsia="Times New Roman" w:hAnsi="Times New Roman" w:cs="Times New Roman"/>
-          <w:b/>
-          <w:bCs/>
-          <w:sz w:val="24"/>
-          <w:szCs w:val="24"/>
-        </w:rPr>
-        <w:t>Tool Used:</w:t>
-      </w:r>
-    </w:p>
-    <w:p>
-      <w:pPr>
-        <w:numPr>
-          <w:ilvl w:val="1"/>
-          <w:numId w:val="2"/>
-        </w:numPr>
-        <w:spacing w:before="100" w:beforeAutospacing="1" w:after="100" w:afterAutospacing="1" w:line="240" w:lineRule="auto"/>
-        <w:rPr>
-          <w:rFonts w:ascii="Times New Roman" w:eastAsia="Times New Roman" w:hAnsi="Times New Roman" w:cs="Times New Roman"/>
-          <w:sz w:val="24"/>
-          <w:szCs w:val="24"/>
-        </w:rPr>
-      </w:pPr>
-      <w:proofErr w:type="spellStart"/>
-      <w:r>
-        <w:rPr>
-          <w:rFonts w:ascii="Times New Roman" w:eastAsia="Times New Roman" w:hAnsi="Times New Roman" w:cs="Times New Roman"/>
-          <w:sz w:val="24"/>
-          <w:szCs w:val="24"/>
-        </w:rPr>
-        <w:t>Reddit</w:t>
-      </w:r>
-      <w:proofErr w:type="spellEnd"/>
-      <w:r>
-        <w:rPr>
-          <w:rFonts w:ascii="Times New Roman" w:eastAsia="Times New Roman" w:hAnsi="Times New Roman" w:cs="Times New Roman"/>
-          <w:sz w:val="24"/>
-          <w:szCs w:val="24"/>
-        </w:rPr>
-        <w:t xml:space="preserve"> API or Public </w:t>
-      </w:r>
-      <w:r>
-        <w:rPr>
-          <w:rFonts w:ascii="Courier New" w:eastAsia="Times New Roman" w:hAnsi="Courier New" w:cs="Courier New"/>
-          <w:sz w:val="20"/>
-          <w:szCs w:val="20"/>
-        </w:rPr>
-        <w:t>.</w:t>
-      </w:r>
-      <w:proofErr w:type="spellStart"/>
-      <w:r>
-        <w:rPr>
-          <w:rFonts w:ascii="Courier New" w:eastAsia="Times New Roman" w:hAnsi="Courier New" w:cs="Courier New"/>
-          <w:sz w:val="20"/>
-          <w:szCs w:val="20"/>
-        </w:rPr>
-        <w:t>json</w:t>
-      </w:r>
-      <w:proofErr w:type="spellEnd"/>
-    </w:p>
-    <w:p>
-      <w:pPr>
-        <w:numPr>
-          <w:ilvl w:val="1"/>
-          <w:numId w:val="2"/>
-        </w:numPr>
-        <w:spacing w:before="100" w:beforeAutospacing="1" w:after="100" w:afterAutospacing="1" w:line="240" w:lineRule="auto"/>
-        <w:rPr>
-          <w:rFonts w:ascii="Times New Roman" w:eastAsia="Times New Roman" w:hAnsi="Times New Roman" w:cs="Times New Roman"/>
-          <w:sz w:val="24"/>
-          <w:szCs w:val="24"/>
-        </w:rPr>
-      </w:pPr>
-      <w:r>
-        <w:rPr>
-          <w:rFonts w:ascii="Times New Roman" w:eastAsia="Times New Roman" w:hAnsi="Times New Roman" w:cs="Times New Roman"/>
-          <w:sz w:val="24"/>
-          <w:szCs w:val="24"/>
-        </w:rPr>
-        <w:t xml:space="preserve"> </w:t>
-      </w:r>
-      <w:proofErr w:type="spellStart"/>
-      <w:r>
-        <w:rPr>
-          <w:rFonts w:ascii="Times New Roman" w:eastAsia="Times New Roman" w:hAnsi="Times New Roman" w:cs="Times New Roman"/>
-          <w:sz w:val="24"/>
-          <w:szCs w:val="24"/>
-        </w:rPr>
-        <w:t>Apify</w:t>
-      </w:r>
-      <w:proofErr w:type="spellEnd"/>
-      <w:r>
-        <w:rPr>
-          <w:rFonts w:ascii="Times New Roman" w:eastAsia="Times New Roman" w:hAnsi="Times New Roman" w:cs="Times New Roman"/>
-          <w:sz w:val="24"/>
-          <w:szCs w:val="24"/>
-        </w:rPr>
-        <w:t xml:space="preserve"> not required</w:t>
-      </w:r>
-    </w:p>
-    <w:p>
-      <w:pPr>
-        <w:numPr>
-          <w:ilvl w:val="0"/>
-          <w:numId w:val="2"/>
-        </w:numPr>
-        <w:spacing w:before="100" w:beforeAutospacing="1" w:after="100" w:afterAutospacing="1" w:line="240" w:lineRule="auto"/>
-        <w:rPr>
-          <w:rFonts w:ascii="Times New Roman" w:eastAsia="Times New Roman" w:hAnsi="Times New Roman" w:cs="Times New Roman"/>
-          <w:sz w:val="24"/>
-          <w:szCs w:val="24"/>
-        </w:rPr>
-      </w:pPr>
-      <w:r>
-        <w:rPr>
-          <w:rFonts w:ascii="Times New Roman" w:eastAsia="Times New Roman" w:hAnsi="Times New Roman" w:cs="Times New Roman"/>
-          <w:b/>
-          <w:bCs/>
-          <w:sz w:val="24"/>
-          <w:szCs w:val="24"/>
-        </w:rPr>
-        <w:t>Cost:</w:t>
-      </w:r>
-      <w:r>
-        <w:rPr>
-          <w:rFonts w:ascii="Times New Roman" w:eastAsia="Times New Roman" w:hAnsi="Times New Roman" w:cs="Times New Roman"/>
-          <w:sz w:val="24"/>
-          <w:szCs w:val="24"/>
-        </w:rPr>
-        <w:t xml:space="preserve"> $0</w:t>
-      </w:r>
-    </w:p>
-    <w:p>
-      <w:pPr>
-        <w:spacing w:before="100" w:beforeAutospacing="1" w:after="100" w:afterAutospacing="1" w:line="240" w:lineRule="auto"/>
-        <w:outlineLvl w:val="2"/>
-        <w:rPr>
-          <w:rFonts w:ascii="Times New Roman" w:eastAsia="Times New Roman" w:hAnsi="Times New Roman" w:cs="Times New Roman"/>
-          <w:b/>
-          <w:bCs/>
-          <w:sz w:val="27"/>
-          <w:szCs w:val="27"/>
-        </w:rPr>
-      </w:pPr>
-      <w:proofErr w:type="spellStart"/>
-      <w:r>
-        <w:rPr>
-          <w:rFonts w:ascii="Times New Roman" w:eastAsia="Times New Roman" w:hAnsi="Times New Roman" w:cs="Times New Roman"/>
-          <w:b/>
-          <w:bCs/>
-          <w:sz w:val="27"/>
-          <w:szCs w:val="27"/>
-        </w:rPr>
-        <w:t>Quora</w:t>
-      </w:r>
-      <w:proofErr w:type="spellEnd"/>
-    </w:p>
-    <w:p>
-      <w:pPr>
-        <w:numPr>
-          <w:ilvl w:val="0"/>
-          <w:numId w:val="3"/>
-        </w:numPr>
-        <w:spacing w:before="100" w:beforeAutospacing="1" w:after="100" w:afterAutospacing="1" w:line="240" w:lineRule="auto"/>
-        <w:rPr>
-          <w:rFonts w:ascii="Times New Roman" w:eastAsia="Times New Roman" w:hAnsi="Times New Roman" w:cs="Times New Roman"/>
-          <w:sz w:val="24"/>
-          <w:szCs w:val="24"/>
-        </w:rPr>
-      </w:pPr>
-      <w:r>
-        <w:rPr>
-          <w:rFonts w:ascii="Times New Roman" w:eastAsia="Times New Roman" w:hAnsi="Times New Roman" w:cs="Times New Roman"/>
-          <w:b/>
-          <w:bCs/>
-          <w:sz w:val="24"/>
-          <w:szCs w:val="24"/>
-        </w:rPr>
-        <w:t>Official API Available:</w:t>
-      </w:r>
-      <w:r>
-        <w:rPr>
-          <w:rFonts w:ascii="Times New Roman" w:eastAsia="Times New Roman" w:hAnsi="Times New Roman" w:cs="Times New Roman"/>
-          <w:sz w:val="24"/>
-          <w:szCs w:val="24"/>
-        </w:rPr>
-        <w:t xml:space="preserve">  No</w:t>
-      </w:r>
-    </w:p>
-    <w:p>
-      <w:pPr>
-        <w:numPr>
-          <w:ilvl w:val="0"/>
-          <w:numId w:val="3"/>
-        </w:numPr>
-        <w:spacing w:before="100" w:beforeAutospacing="1" w:after="100" w:afterAutospacing="1" w:line="240" w:lineRule="auto"/>
-        <w:rPr>
-          <w:rFonts w:ascii="Times New Roman" w:eastAsia="Times New Roman" w:hAnsi="Times New Roman" w:cs="Times New Roman"/>
-          <w:sz w:val="24"/>
-          <w:szCs w:val="24"/>
-        </w:rPr>
-      </w:pPr>
-      <w:r>
-        <w:rPr>
-          <w:rFonts w:ascii="Times New Roman" w:eastAsia="Times New Roman" w:hAnsi="Times New Roman" w:cs="Times New Roman"/>
-          <w:b/>
-          <w:bCs/>
-          <w:sz w:val="24"/>
-          <w:szCs w:val="24"/>
-        </w:rPr>
-        <w:t>Tool Used:</w:t>
-      </w:r>
-    </w:p>
-    <w:p>
-      <w:pPr>
-        <w:numPr>
-          <w:ilvl w:val="1"/>
-          <w:numId w:val="3"/>
-        </w:numPr>
-        <w:spacing w:before="100" w:beforeAutospacing="1" w:after="100" w:afterAutospacing="1" w:line="240" w:lineRule="auto"/>
-        <w:rPr>
-          <w:rFonts w:ascii="Times New Roman" w:eastAsia="Times New Roman" w:hAnsi="Times New Roman" w:cs="Times New Roman"/>
-          <w:sz w:val="24"/>
-          <w:szCs w:val="24"/>
-        </w:rPr>
-      </w:pPr>
-      <w:proofErr w:type="spellStart"/>
-      <w:r>
-        <w:rPr>
-          <w:rFonts w:ascii="Times New Roman" w:eastAsia="Times New Roman" w:hAnsi="Times New Roman" w:cs="Times New Roman"/>
-          <w:b/>
-          <w:bCs/>
-          <w:sz w:val="24"/>
-          <w:szCs w:val="24"/>
-        </w:rPr>
-        <w:t>Apify</w:t>
-      </w:r>
-      <w:proofErr w:type="spellEnd"/>
-      <w:r>
-        <w:rPr>
-          <w:rFonts w:ascii="Times New Roman" w:eastAsia="Times New Roman" w:hAnsi="Times New Roman" w:cs="Times New Roman"/>
-          <w:b/>
-          <w:bCs/>
-          <w:sz w:val="24"/>
-          <w:szCs w:val="24"/>
-        </w:rPr>
-        <w:t xml:space="preserve"> – Generic Web Scraper (No Login)</w:t>
-      </w:r>
-    </w:p>
-    <w:p>
-      <w:pPr>
-        <w:numPr>
-          <w:ilvl w:val="0"/>
-          <w:numId w:val="3"/>
-        </w:numPr>
-        <w:spacing w:before="100" w:beforeAutospacing="1" w:after="100" w:afterAutospacing="1" w:line="240" w:lineRule="auto"/>
-        <w:rPr>
-          <w:rFonts w:ascii="Times New Roman" w:eastAsia="Times New Roman" w:hAnsi="Times New Roman" w:cs="Times New Roman"/>
-          <w:sz w:val="24"/>
-          <w:szCs w:val="24"/>
-        </w:rPr>
-      </w:pPr>
-      <w:r>
-        <w:rPr>
-          <w:rFonts w:ascii="Times New Roman" w:eastAsia="Times New Roman" w:hAnsi="Times New Roman" w:cs="Times New Roman"/>
-          <w:b/>
-          <w:bCs/>
-          <w:sz w:val="24"/>
-          <w:szCs w:val="24"/>
-        </w:rPr>
-        <w:t>Data Available:</w:t>
-      </w:r>
-    </w:p>
-    <w:p>
-      <w:pPr>
-        <w:numPr>
-          <w:ilvl w:val="1"/>
-          <w:numId w:val="3"/>
-        </w:numPr>
-        <w:spacing w:before="100" w:beforeAutospacing="1" w:after="100" w:afterAutospacing="1" w:line="240" w:lineRule="auto"/>
-        <w:rPr>
-          <w:rFonts w:ascii="Times New Roman" w:eastAsia="Times New Roman" w:hAnsi="Times New Roman" w:cs="Times New Roman"/>
-          <w:sz w:val="24"/>
-          <w:szCs w:val="24"/>
-        </w:rPr>
-      </w:pPr>
-      <w:r>
-        <w:rPr>
-          <w:rFonts w:ascii="Times New Roman" w:eastAsia="Times New Roman" w:hAnsi="Times New Roman" w:cs="Times New Roman"/>
-          <w:sz w:val="24"/>
-          <w:szCs w:val="24"/>
-        </w:rPr>
-        <w:t>Answer count</w:t>
-      </w:r>
-    </w:p>
-    <w:p>
-      <w:pPr>
-        <w:numPr>
-          <w:ilvl w:val="1"/>
-          <w:numId w:val="3"/>
-        </w:numPr>
-        <w:spacing w:before="100" w:beforeAutospacing="1" w:after="100" w:afterAutospacing="1" w:line="240" w:lineRule="auto"/>
-        <w:rPr>
-          <w:rFonts w:ascii="Times New Roman" w:eastAsia="Times New Roman" w:hAnsi="Times New Roman" w:cs="Times New Roman"/>
-          <w:sz w:val="24"/>
-          <w:szCs w:val="24"/>
-        </w:rPr>
-      </w:pPr>
-      <w:r>
-        <w:rPr>
-          <w:rFonts w:ascii="Times New Roman" w:eastAsia="Times New Roman" w:hAnsi="Times New Roman" w:cs="Times New Roman"/>
-          <w:sz w:val="24"/>
-          <w:szCs w:val="24"/>
-        </w:rPr>
-        <w:t>Followers (public)</w:t>
-      </w:r>
-    </w:p>
-    <w:p>
-      <w:pPr>
-        <w:numPr>
-          <w:ilvl w:val="1"/>
-          <w:numId w:val="3"/>
-        </w:numPr>
-        <w:spacing w:before="100" w:beforeAutospacing="1" w:after="100" w:afterAutospacing="1" w:line="240" w:lineRule="auto"/>
-        <w:rPr>
-          <w:rFonts w:ascii="Times New Roman" w:eastAsia="Times New Roman" w:hAnsi="Times New Roman" w:cs="Times New Roman"/>
-          <w:sz w:val="24"/>
-          <w:szCs w:val="24"/>
-        </w:rPr>
-      </w:pPr>
-      <w:r>
-        <w:rPr>
-          <w:rFonts w:ascii="Times New Roman" w:eastAsia="Times New Roman" w:hAnsi="Times New Roman" w:cs="Times New Roman"/>
-          <w:sz w:val="24"/>
-          <w:szCs w:val="24"/>
-        </w:rPr>
-        <w:t>Profile snapshot</w:t>
-      </w:r>
-    </w:p>
-    <w:p>
-      <w:pPr>
-        <w:spacing w:before="100" w:beforeAutospacing="1" w:after="100" w:afterAutospacing="1" w:line="240" w:lineRule="auto"/>
-        <w:outlineLvl w:val="2"/>
-        <w:rPr>
-          <w:rFonts w:ascii="Times New Roman" w:eastAsia="Times New Roman" w:hAnsi="Times New Roman" w:cs="Times New Roman"/>
-          <w:b/>
-          <w:bCs/>
-          <w:sz w:val="27"/>
-          <w:szCs w:val="27"/>
-        </w:rPr>
-      </w:pPr>
-      <w:r>
-        <w:rPr>
-          <w:rFonts w:ascii="Times New Roman" w:eastAsia="Times New Roman" w:hAnsi="Times New Roman" w:cs="Times New Roman"/>
-          <w:b/>
-          <w:bCs/>
-          <w:sz w:val="27"/>
-          <w:szCs w:val="27"/>
-        </w:rPr>
-        <w:t>BHW (</w:t>
-      </w:r>
-      <w:proofErr w:type="spellStart"/>
-      <w:r>
-        <w:rPr>
-          <w:rFonts w:ascii="Times New Roman" w:eastAsia="Times New Roman" w:hAnsi="Times New Roman" w:cs="Times New Roman"/>
-          <w:b/>
-          <w:bCs/>
-          <w:sz w:val="27"/>
-          <w:szCs w:val="27"/>
-        </w:rPr>
-        <w:t>BlackHatWorld</w:t>
-      </w:r>
-      <w:proofErr w:type="spellEnd"/>
-      <w:r>
-        <w:rPr>
-          <w:rFonts w:ascii="Times New Roman" w:eastAsia="Times New Roman" w:hAnsi="Times New Roman" w:cs="Times New Roman"/>
-          <w:b/>
-          <w:bCs/>
-          <w:sz w:val="27"/>
-          <w:szCs w:val="27"/>
-        </w:rPr>
-        <w:t>)</w:t>
-      </w:r>
-    </w:p>
-    <w:p>
-      <w:pPr>
-        <w:numPr>
-          <w:ilvl w:val="0"/>
-          <w:numId w:val="4"/>
-        </w:numPr>
-        <w:spacing w:before="100" w:beforeAutospacing="1" w:after="100" w:afterAutospacing="1" w:line="240" w:lineRule="auto"/>
-        <w:rPr>
-          <w:rFonts w:ascii="Times New Roman" w:eastAsia="Times New Roman" w:hAnsi="Times New Roman" w:cs="Times New Roman"/>
-          <w:sz w:val="24"/>
-          <w:szCs w:val="24"/>
-        </w:rPr>
-      </w:pPr>
-      <w:r>
-        <w:rPr>
-          <w:rFonts w:ascii="Times New Roman" w:eastAsia="Times New Roman" w:hAnsi="Times New Roman" w:cs="Times New Roman"/>
-          <w:b/>
-          <w:bCs/>
-          <w:sz w:val="24"/>
-          <w:szCs w:val="24"/>
-        </w:rPr>
-        <w:t>Official API Available:</w:t>
-      </w:r>
-      <w:r>
-        <w:rPr>
-          <w:rFonts w:ascii="Times New Roman" w:eastAsia="Times New Roman" w:hAnsi="Times New Roman" w:cs="Times New Roman"/>
-          <w:sz w:val="24"/>
-          <w:szCs w:val="24"/>
-        </w:rPr>
-        <w:t xml:space="preserve">  No</w:t>
-      </w:r>
-    </w:p>
-    <w:p>
-      <w:pPr>
-        <w:numPr>
-          <w:ilvl w:val="0"/>
-          <w:numId w:val="4"/>
-        </w:numPr>
-        <w:spacing w:before="100" w:beforeAutospacing="1" w:after="100" w:afterAutospacing="1" w:line="240" w:lineRule="auto"/>
-        <w:rPr>
-          <w:rFonts w:ascii="Times New Roman" w:eastAsia="Times New Roman" w:hAnsi="Times New Roman" w:cs="Times New Roman"/>
-          <w:sz w:val="24"/>
-          <w:szCs w:val="24"/>
-        </w:rPr>
-      </w:pPr>
-      <w:r>
-        <w:rPr>
-          <w:rFonts w:ascii="Times New Roman" w:eastAsia="Times New Roman" w:hAnsi="Times New Roman" w:cs="Times New Roman"/>
-          <w:b/>
-          <w:bCs/>
-          <w:sz w:val="24"/>
-          <w:szCs w:val="24"/>
-        </w:rPr>
-        <w:t>Tool Used:</w:t>
-      </w:r>
-    </w:p>
-    <w:p>
-      <w:pPr>
-        <w:numPr>
-          <w:ilvl w:val="1"/>
-          <w:numId w:val="4"/>
-        </w:numPr>
-        <w:spacing w:before="100" w:beforeAutospacing="1" w:after="100" w:afterAutospacing="1" w:line="240" w:lineRule="auto"/>
-        <w:rPr>
-          <w:rFonts w:ascii="Times New Roman" w:eastAsia="Times New Roman" w:hAnsi="Times New Roman" w:cs="Times New Roman"/>
-          <w:sz w:val="24"/>
-          <w:szCs w:val="24"/>
-        </w:rPr>
-      </w:pPr>
-      <w:proofErr w:type="spellStart"/>
-      <w:r>
-        <w:rPr>
-          <w:rFonts w:ascii="Times New Roman" w:eastAsia="Times New Roman" w:hAnsi="Times New Roman" w:cs="Times New Roman"/>
-          <w:b/>
-          <w:bCs/>
-          <w:sz w:val="24"/>
-          <w:szCs w:val="24"/>
-        </w:rPr>
-        <w:t>Apify</w:t>
-      </w:r>
-      <w:proofErr w:type="spellEnd"/>
-      <w:r>
-        <w:rPr>
-          <w:rFonts w:ascii="Times New Roman" w:eastAsia="Times New Roman" w:hAnsi="Times New Roman" w:cs="Times New Roman"/>
-          <w:b/>
-          <w:bCs/>
-          <w:sz w:val="24"/>
-          <w:szCs w:val="24"/>
-        </w:rPr>
-        <w:t xml:space="preserve"> – Generic Web Scraper</w:t>
-      </w:r>
-    </w:p>
-    <w:p>
-      <w:pPr>
-        <w:numPr>
-          <w:ilvl w:val="0"/>
-          <w:numId w:val="4"/>
-        </w:numPr>
-        <w:spacing w:before="100" w:beforeAutospacing="1" w:after="100" w:afterAutospacing="1" w:line="240" w:lineRule="auto"/>
-        <w:rPr>
-          <w:rFonts w:ascii="Times New Roman" w:eastAsia="Times New Roman" w:hAnsi="Times New Roman" w:cs="Times New Roman"/>
-          <w:sz w:val="24"/>
-          <w:szCs w:val="24"/>
-        </w:rPr>
-      </w:pPr>
-      <w:r>
-        <w:rPr>
-          <w:rFonts w:ascii="Times New Roman" w:eastAsia="Times New Roman" w:hAnsi="Times New Roman" w:cs="Times New Roman"/>
-          <w:b/>
-          <w:bCs/>
-          <w:sz w:val="24"/>
-          <w:szCs w:val="24"/>
-        </w:rPr>
-        <w:t>Data Available (Public):</w:t>
-      </w:r>
-    </w:p>
-    <w:p>
-      <w:pPr>
-        <w:numPr>
-          <w:ilvl w:val="1"/>
-          <w:numId w:val="4"/>
-        </w:numPr>
-        <w:spacing w:before="100" w:beforeAutospacing="1" w:after="100" w:afterAutospacing="1" w:line="240" w:lineRule="auto"/>
-        <w:rPr>
-          <w:rFonts w:ascii="Times New Roman" w:eastAsia="Times New Roman" w:hAnsi="Times New Roman" w:cs="Times New Roman"/>
-          <w:sz w:val="24"/>
-          <w:szCs w:val="24"/>
-        </w:rPr>
-      </w:pPr>
-      <w:r>
-        <w:rPr>
-          <w:rFonts w:ascii="Times New Roman" w:eastAsia="Times New Roman" w:hAnsi="Times New Roman" w:cs="Times New Roman"/>
-          <w:sz w:val="24"/>
-          <w:szCs w:val="24"/>
-        </w:rPr>
-        <w:lastRenderedPageBreak/>
-        <w:t>Messages</w:t>
-      </w:r>
-    </w:p>
-    <w:p>
-      <w:pPr>
-        <w:numPr>
-          <w:ilvl w:val="1"/>
-          <w:numId w:val="4"/>
-        </w:numPr>
-        <w:spacing w:before="100" w:beforeAutospacing="1" w:after="100" w:afterAutospacing="1" w:line="240" w:lineRule="auto"/>
-        <w:rPr>
-          <w:rFonts w:ascii="Times New Roman" w:eastAsia="Times New Roman" w:hAnsi="Times New Roman" w:cs="Times New Roman"/>
-          <w:sz w:val="24"/>
-          <w:szCs w:val="24"/>
-        </w:rPr>
-      </w:pPr>
-      <w:r>
-        <w:rPr>
-          <w:rFonts w:ascii="Times New Roman" w:eastAsia="Times New Roman" w:hAnsi="Times New Roman" w:cs="Times New Roman"/>
-          <w:sz w:val="24"/>
-          <w:szCs w:val="24"/>
-        </w:rPr>
-        <w:t>Reaction score</w:t>
-      </w:r>
-    </w:p>
-    <w:p>
-      <w:pPr>
-        <w:numPr>
-          <w:ilvl w:val="1"/>
-          <w:numId w:val="4"/>
-        </w:numPr>
-        <w:spacing w:before="100" w:beforeAutospacing="1" w:after="100" w:afterAutospacing="1" w:line="240" w:lineRule="auto"/>
-        <w:rPr>
-          <w:rFonts w:ascii="Times New Roman" w:eastAsia="Times New Roman" w:hAnsi="Times New Roman" w:cs="Times New Roman"/>
-          <w:sz w:val="24"/>
-          <w:szCs w:val="24"/>
-        </w:rPr>
-      </w:pPr>
-      <w:r>
-        <w:rPr>
-          <w:rFonts w:ascii="Times New Roman" w:eastAsia="Times New Roman" w:hAnsi="Times New Roman" w:cs="Times New Roman"/>
-          <w:sz w:val="24"/>
-          <w:szCs w:val="24"/>
-        </w:rPr>
-        <w:t>Points</w:t>
-      </w:r>
-    </w:p>
-    <w:p>
-      <w:pPr>
-        <w:numPr>
-          <w:ilvl w:val="1"/>
-          <w:numId w:val="4"/>
-        </w:numPr>
-        <w:spacing w:before="100" w:beforeAutospacing="1" w:after="100" w:afterAutospacing="1" w:line="240" w:lineRule="auto"/>
-        <w:rPr>
-          <w:rFonts w:ascii="Times New Roman" w:eastAsia="Times New Roman" w:hAnsi="Times New Roman" w:cs="Times New Roman"/>
-          <w:sz w:val="24"/>
-          <w:szCs w:val="24"/>
-        </w:rPr>
-      </w:pPr>
-      <w:r>
-        <w:rPr>
-          <w:rFonts w:ascii="Times New Roman" w:eastAsia="Times New Roman" w:hAnsi="Times New Roman" w:cs="Times New Roman"/>
-          <w:sz w:val="24"/>
-          <w:szCs w:val="24"/>
-        </w:rPr>
-        <w:t>Profile status</w:t>
-      </w:r>
+          <w:numId w:val="7"/>
+        </w:numPr>
+        <w:spacing w:before="100" w:beforeAutospacing="1" w:after="100" w:afterAutospacing="1" w:line="240" w:lineRule="auto"/>
+        <w:rPr>
+          <w:rFonts w:ascii="Times New Roman" w:eastAsia="Times New Roman" w:hAnsi="Times New Roman" w:cs="Times New Roman"/>
+          <w:sz w:val="24"/>
+          <w:szCs w:val="24"/>
+        </w:rPr>
+      </w:pPr>
+      <w:r>
+        <w:rPr>
+          <w:rFonts w:ascii="Times New Roman" w:eastAsia="Times New Roman" w:hAnsi="Times New Roman" w:cs="Times New Roman"/>
+          <w:sz w:val="24"/>
+          <w:szCs w:val="24"/>
+        </w:rPr>
+        <w:t>BHW: every 72 hours</w:t>
+      </w:r>
+      <w:bookmarkStart w:id="0" w:name="_GoBack"/>
+      <w:bookmarkEnd w:id="0"/>
     </w:p>
     <w:p>
       <w:pPr>
@@ -1223,609 +1750,7 @@
           <w:sz w:val="36"/>
           <w:szCs w:val="36"/>
         </w:rPr>
-        <w:t>2️</w:t>
-      </w:r>
-      <w:r>
-        <w:rPr>
-          <w:rFonts w:ascii="Tahoma" w:eastAsia="Times New Roman" w:hAnsi="Tahoma" w:cs="Tahoma"/>
-          <w:b/>
-          <w:bCs/>
-          <w:sz w:val="36"/>
-          <w:szCs w:val="36"/>
-        </w:rPr>
-        <w:t xml:space="preserve"> </w:t>
-      </w:r>
-      <w:r>
-        <w:rPr>
-          <w:rFonts w:ascii="Times New Roman" w:eastAsia="Times New Roman" w:hAnsi="Times New Roman" w:cs="Times New Roman"/>
-          <w:b/>
-          <w:bCs/>
-          <w:sz w:val="36"/>
-          <w:szCs w:val="36"/>
-        </w:rPr>
-        <w:t xml:space="preserve">Why </w:t>
-      </w:r>
-      <w:proofErr w:type="spellStart"/>
-      <w:r>
-        <w:rPr>
-          <w:rFonts w:ascii="Times New Roman" w:eastAsia="Times New Roman" w:hAnsi="Times New Roman" w:cs="Times New Roman"/>
-          <w:b/>
-          <w:bCs/>
-          <w:sz w:val="36"/>
-          <w:szCs w:val="36"/>
-        </w:rPr>
-        <w:t>Apify</w:t>
-      </w:r>
-      <w:proofErr w:type="spellEnd"/>
-      <w:r>
-        <w:rPr>
-          <w:rFonts w:ascii="Times New Roman" w:eastAsia="Times New Roman" w:hAnsi="Times New Roman" w:cs="Times New Roman"/>
-          <w:b/>
-          <w:bCs/>
-          <w:sz w:val="36"/>
-          <w:szCs w:val="36"/>
-        </w:rPr>
-        <w:t xml:space="preserve"> Is Used</w:t>
-      </w:r>
-    </w:p>
-    <w:p>
-      <w:pPr>
-        <w:numPr>
-          <w:ilvl w:val="0"/>
-          <w:numId w:val="5"/>
-        </w:numPr>
-        <w:spacing w:before="100" w:beforeAutospacing="1" w:after="100" w:afterAutospacing="1" w:line="240" w:lineRule="auto"/>
-        <w:rPr>
-          <w:rFonts w:ascii="Times New Roman" w:eastAsia="Times New Roman" w:hAnsi="Times New Roman" w:cs="Times New Roman"/>
-          <w:sz w:val="24"/>
-          <w:szCs w:val="24"/>
-        </w:rPr>
-      </w:pPr>
-      <w:r>
-        <w:rPr>
-          <w:rFonts w:ascii="Times New Roman" w:eastAsia="Times New Roman" w:hAnsi="Times New Roman" w:cs="Times New Roman"/>
-          <w:sz w:val="24"/>
-          <w:szCs w:val="24"/>
-        </w:rPr>
-        <w:t>No login / no password sharing</w:t>
-      </w:r>
-    </w:p>
-    <w:p>
-      <w:pPr>
-        <w:numPr>
-          <w:ilvl w:val="0"/>
-          <w:numId w:val="5"/>
-        </w:numPr>
-        <w:spacing w:before="100" w:beforeAutospacing="1" w:after="100" w:afterAutospacing="1" w:line="240" w:lineRule="auto"/>
-        <w:rPr>
-          <w:rFonts w:ascii="Times New Roman" w:eastAsia="Times New Roman" w:hAnsi="Times New Roman" w:cs="Times New Roman"/>
-          <w:sz w:val="24"/>
-          <w:szCs w:val="24"/>
-        </w:rPr>
-      </w:pPr>
-      <w:r>
-        <w:rPr>
-          <w:rFonts w:ascii="Times New Roman" w:eastAsia="Times New Roman" w:hAnsi="Times New Roman" w:cs="Times New Roman"/>
-          <w:sz w:val="24"/>
-          <w:szCs w:val="24"/>
-        </w:rPr>
-        <w:t xml:space="preserve">Built-in </w:t>
-      </w:r>
-      <w:r>
-        <w:rPr>
-          <w:rFonts w:ascii="Times New Roman" w:eastAsia="Times New Roman" w:hAnsi="Times New Roman" w:cs="Times New Roman"/>
-          <w:b/>
-          <w:bCs/>
-          <w:sz w:val="24"/>
-          <w:szCs w:val="24"/>
-        </w:rPr>
-        <w:t>proxy rotation</w:t>
-      </w:r>
-      <w:r>
-        <w:rPr>
-          <w:rFonts w:ascii="Times New Roman" w:eastAsia="Times New Roman" w:hAnsi="Times New Roman" w:cs="Times New Roman"/>
-          <w:sz w:val="24"/>
-          <w:szCs w:val="24"/>
-        </w:rPr>
-        <w:t xml:space="preserve"> (residential proxies)</w:t>
-      </w:r>
-    </w:p>
-    <w:p>
-      <w:pPr>
-        <w:numPr>
-          <w:ilvl w:val="0"/>
-          <w:numId w:val="5"/>
-        </w:numPr>
-        <w:spacing w:before="100" w:beforeAutospacing="1" w:after="100" w:afterAutospacing="1" w:line="240" w:lineRule="auto"/>
-        <w:rPr>
-          <w:rFonts w:ascii="Times New Roman" w:eastAsia="Times New Roman" w:hAnsi="Times New Roman" w:cs="Times New Roman"/>
-          <w:sz w:val="24"/>
-          <w:szCs w:val="24"/>
-        </w:rPr>
-      </w:pPr>
-      <w:r>
-        <w:rPr>
-          <w:rFonts w:ascii="Times New Roman" w:eastAsia="Times New Roman" w:hAnsi="Times New Roman" w:cs="Times New Roman"/>
-          <w:sz w:val="24"/>
-          <w:szCs w:val="24"/>
-        </w:rPr>
-        <w:t>Handles IP bans &amp; retries automatically</w:t>
-      </w:r>
-    </w:p>
-    <w:p>
-      <w:pPr>
-        <w:numPr>
-          <w:ilvl w:val="0"/>
-          <w:numId w:val="5"/>
-        </w:numPr>
-        <w:spacing w:before="100" w:beforeAutospacing="1" w:after="100" w:afterAutospacing="1" w:line="240" w:lineRule="auto"/>
-        <w:rPr>
-          <w:rFonts w:ascii="Times New Roman" w:eastAsia="Times New Roman" w:hAnsi="Times New Roman" w:cs="Times New Roman"/>
-          <w:sz w:val="24"/>
-          <w:szCs w:val="24"/>
-        </w:rPr>
-      </w:pPr>
-      <w:r>
-        <w:rPr>
-          <w:rFonts w:ascii="Times New Roman" w:eastAsia="Times New Roman" w:hAnsi="Times New Roman" w:cs="Times New Roman"/>
-          <w:sz w:val="24"/>
-          <w:szCs w:val="24"/>
-        </w:rPr>
-        <w:t>Low maintenance</w:t>
-      </w:r>
-    </w:p>
-    <w:p>
-      <w:pPr>
-        <w:numPr>
-          <w:ilvl w:val="0"/>
-          <w:numId w:val="5"/>
-        </w:numPr>
-        <w:spacing w:before="100" w:beforeAutospacing="1" w:after="100" w:afterAutospacing="1" w:line="240" w:lineRule="auto"/>
-        <w:rPr>
-          <w:rFonts w:ascii="Times New Roman" w:eastAsia="Times New Roman" w:hAnsi="Times New Roman" w:cs="Times New Roman"/>
-          <w:sz w:val="24"/>
-          <w:szCs w:val="24"/>
-        </w:rPr>
-      </w:pPr>
-      <w:r>
-        <w:rPr>
-          <w:rFonts w:ascii="Times New Roman" w:eastAsia="Times New Roman" w:hAnsi="Times New Roman" w:cs="Times New Roman"/>
-          <w:sz w:val="24"/>
-          <w:szCs w:val="24"/>
-        </w:rPr>
-        <w:t>Scales easily to 600+ profiles</w:t>
-      </w:r>
-    </w:p>
-    <w:p>
-      <w:pPr>
-        <w:numPr>
-          <w:ilvl w:val="0"/>
-          <w:numId w:val="5"/>
-        </w:numPr>
-        <w:spacing w:before="100" w:beforeAutospacing="1" w:after="100" w:afterAutospacing="1" w:line="240" w:lineRule="auto"/>
-        <w:rPr>
-          <w:rFonts w:ascii="Times New Roman" w:eastAsia="Times New Roman" w:hAnsi="Times New Roman" w:cs="Times New Roman"/>
-          <w:sz w:val="24"/>
-          <w:szCs w:val="24"/>
-        </w:rPr>
-      </w:pPr>
-      <w:r>
-        <w:rPr>
-          <w:rFonts w:ascii="Times New Roman" w:eastAsia="Times New Roman" w:hAnsi="Times New Roman" w:cs="Times New Roman"/>
-          <w:sz w:val="24"/>
-          <w:szCs w:val="24"/>
-        </w:rPr>
-        <w:t>Much safer than headless browsers or custom bots</w:t>
-      </w:r>
-    </w:p>
-    <w:p>
-      <w:pPr>
-        <w:spacing w:before="100" w:beforeAutospacing="1" w:after="100" w:afterAutospacing="1" w:line="240" w:lineRule="auto"/>
-        <w:ind w:left="720"/>
-        <w:rPr>
-          <w:rFonts w:ascii="Times New Roman" w:eastAsia="Times New Roman" w:hAnsi="Times New Roman" w:cs="Times New Roman"/>
-          <w:sz w:val="24"/>
-          <w:szCs w:val="24"/>
-        </w:rPr>
-      </w:pPr>
-      <w:proofErr w:type="gramStart"/>
-      <w:r>
-        <w:rPr>
-          <w:rFonts w:ascii="Times New Roman" w:eastAsia="Times New Roman" w:hAnsi="Times New Roman" w:cs="Times New Roman"/>
-          <w:sz w:val="24"/>
-          <w:szCs w:val="24"/>
-        </w:rPr>
-        <w:t>Note :</w:t>
-      </w:r>
-      <w:proofErr w:type="gramEnd"/>
-      <w:r>
-        <w:rPr>
-          <w:rFonts w:ascii="Times New Roman" w:eastAsia="Times New Roman" w:hAnsi="Times New Roman" w:cs="Times New Roman"/>
-          <w:sz w:val="24"/>
-          <w:szCs w:val="24"/>
-        </w:rPr>
-        <w:t xml:space="preserve"> </w:t>
-      </w:r>
-      <w:r>
-        <w:t>Data is Observational, Not Authoritative</w:t>
-      </w:r>
-    </w:p>
-    <w:p>
-      <w:pPr>
-        <w:spacing w:before="100" w:beforeAutospacing="1" w:after="100" w:afterAutospacing="1" w:line="240" w:lineRule="auto"/>
-        <w:outlineLvl w:val="1"/>
-        <w:rPr>
-          <w:rFonts w:ascii="Times New Roman" w:eastAsia="Times New Roman" w:hAnsi="Times New Roman" w:cs="Times New Roman"/>
-          <w:b/>
-          <w:bCs/>
-          <w:sz w:val="36"/>
-          <w:szCs w:val="36"/>
-        </w:rPr>
-      </w:pPr>
-      <w:r>
-        <w:rPr>
-          <w:rFonts w:ascii="Times New Roman" w:eastAsia="Times New Roman" w:hAnsi="Times New Roman" w:cs="Times New Roman"/>
-          <w:b/>
-          <w:bCs/>
-          <w:sz w:val="36"/>
-          <w:szCs w:val="36"/>
-        </w:rPr>
-        <w:t>3️</w:t>
-      </w:r>
-      <w:r>
-        <w:rPr>
-          <w:rFonts w:ascii="Tahoma" w:eastAsia="Times New Roman" w:hAnsi="Tahoma" w:cs="Tahoma"/>
-          <w:b/>
-          <w:bCs/>
-          <w:sz w:val="36"/>
-          <w:szCs w:val="36"/>
-        </w:rPr>
-        <w:t xml:space="preserve"> </w:t>
-      </w:r>
-      <w:r>
-        <w:rPr>
-          <w:rFonts w:ascii="Times New Roman" w:eastAsia="Times New Roman" w:hAnsi="Times New Roman" w:cs="Times New Roman"/>
-          <w:b/>
-          <w:bCs/>
-          <w:sz w:val="36"/>
-          <w:szCs w:val="36"/>
-        </w:rPr>
-        <w:t>Cost Estimation (Monthly)</w:t>
-      </w:r>
-    </w:p>
-    <w:p>
-      <w:pPr>
-        <w:spacing w:before="100" w:beforeAutospacing="1" w:after="100" w:afterAutospacing="1" w:line="240" w:lineRule="auto"/>
-        <w:outlineLvl w:val="2"/>
-        <w:rPr>
-          <w:rFonts w:ascii="Times New Roman" w:eastAsia="Times New Roman" w:hAnsi="Times New Roman" w:cs="Times New Roman"/>
-          <w:b/>
-          <w:bCs/>
-          <w:sz w:val="27"/>
-          <w:szCs w:val="27"/>
-        </w:rPr>
-      </w:pPr>
-      <w:r>
-        <w:rPr>
-          <w:rFonts w:ascii="Times New Roman" w:eastAsia="Times New Roman" w:hAnsi="Times New Roman" w:cs="Times New Roman"/>
-          <w:b/>
-          <w:bCs/>
-          <w:sz w:val="27"/>
-          <w:szCs w:val="27"/>
-        </w:rPr>
-        <w:t>If run once per day:</w:t>
-      </w:r>
-    </w:p>
-    <w:p>
-      <w:pPr>
-        <w:numPr>
-          <w:ilvl w:val="0"/>
-          <w:numId w:val="6"/>
-        </w:numPr>
-        <w:spacing w:before="100" w:beforeAutospacing="1" w:after="100" w:afterAutospacing="1" w:line="240" w:lineRule="auto"/>
-        <w:rPr>
-          <w:rFonts w:ascii="Times New Roman" w:eastAsia="Times New Roman" w:hAnsi="Times New Roman" w:cs="Times New Roman"/>
-          <w:sz w:val="24"/>
-          <w:szCs w:val="24"/>
-        </w:rPr>
-      </w:pPr>
-      <w:proofErr w:type="spellStart"/>
-      <w:r>
-        <w:rPr>
-          <w:rFonts w:ascii="Times New Roman" w:eastAsia="Times New Roman" w:hAnsi="Times New Roman" w:cs="Times New Roman"/>
-          <w:sz w:val="24"/>
-          <w:szCs w:val="24"/>
-        </w:rPr>
-        <w:t>Instagram</w:t>
-      </w:r>
-      <w:proofErr w:type="spellEnd"/>
-      <w:r>
-        <w:rPr>
-          <w:rFonts w:ascii="Times New Roman" w:eastAsia="Times New Roman" w:hAnsi="Times New Roman" w:cs="Times New Roman"/>
-          <w:sz w:val="24"/>
-          <w:szCs w:val="24"/>
-        </w:rPr>
-        <w:t xml:space="preserve"> (100): ~$2</w:t>
-      </w:r>
-    </w:p>
-    <w:p>
-      <w:pPr>
-        <w:numPr>
-          <w:ilvl w:val="0"/>
-          <w:numId w:val="6"/>
-        </w:numPr>
-        <w:spacing w:before="100" w:beforeAutospacing="1" w:after="100" w:afterAutospacing="1" w:line="240" w:lineRule="auto"/>
-        <w:rPr>
-          <w:rFonts w:ascii="Times New Roman" w:eastAsia="Times New Roman" w:hAnsi="Times New Roman" w:cs="Times New Roman"/>
-          <w:sz w:val="24"/>
-          <w:szCs w:val="24"/>
-        </w:rPr>
-      </w:pPr>
-      <w:proofErr w:type="spellStart"/>
-      <w:r>
-        <w:rPr>
-          <w:rFonts w:ascii="Times New Roman" w:eastAsia="Times New Roman" w:hAnsi="Times New Roman" w:cs="Times New Roman"/>
-          <w:sz w:val="24"/>
-          <w:szCs w:val="24"/>
-        </w:rPr>
-        <w:t>Quora</w:t>
-      </w:r>
-      <w:proofErr w:type="spellEnd"/>
-      <w:r>
-        <w:rPr>
-          <w:rFonts w:ascii="Times New Roman" w:eastAsia="Times New Roman" w:hAnsi="Times New Roman" w:cs="Times New Roman"/>
-          <w:sz w:val="24"/>
-          <w:szCs w:val="24"/>
-        </w:rPr>
-        <w:t xml:space="preserve"> (200): ~$2.5</w:t>
-      </w:r>
-    </w:p>
-    <w:p>
-      <w:pPr>
-        <w:numPr>
-          <w:ilvl w:val="0"/>
-          <w:numId w:val="6"/>
-        </w:numPr>
-        <w:spacing w:before="100" w:beforeAutospacing="1" w:after="100" w:afterAutospacing="1" w:line="240" w:lineRule="auto"/>
-        <w:rPr>
-          <w:rFonts w:ascii="Times New Roman" w:eastAsia="Times New Roman" w:hAnsi="Times New Roman" w:cs="Times New Roman"/>
-          <w:sz w:val="24"/>
-          <w:szCs w:val="24"/>
-        </w:rPr>
-      </w:pPr>
-      <w:r>
-        <w:rPr>
-          <w:rFonts w:ascii="Times New Roman" w:eastAsia="Times New Roman" w:hAnsi="Times New Roman" w:cs="Times New Roman"/>
-          <w:sz w:val="24"/>
-          <w:szCs w:val="24"/>
-        </w:rPr>
-        <w:t>BHW (100): ~$5</w:t>
-      </w:r>
-    </w:p>
-    <w:p>
-      <w:pPr>
-        <w:numPr>
-          <w:ilvl w:val="0"/>
-          <w:numId w:val="6"/>
-        </w:numPr>
-        <w:spacing w:before="100" w:beforeAutospacing="1" w:after="100" w:afterAutospacing="1" w:line="240" w:lineRule="auto"/>
-        <w:rPr>
-          <w:rFonts w:ascii="Times New Roman" w:eastAsia="Times New Roman" w:hAnsi="Times New Roman" w:cs="Times New Roman"/>
-          <w:sz w:val="24"/>
-          <w:szCs w:val="24"/>
-        </w:rPr>
-      </w:pPr>
-      <w:proofErr w:type="spellStart"/>
-      <w:r>
-        <w:rPr>
-          <w:rFonts w:ascii="Times New Roman" w:eastAsia="Times New Roman" w:hAnsi="Times New Roman" w:cs="Times New Roman"/>
-          <w:sz w:val="24"/>
-          <w:szCs w:val="24"/>
-        </w:rPr>
-        <w:t>Reddit</w:t>
-      </w:r>
-      <w:proofErr w:type="spellEnd"/>
-      <w:r>
-        <w:rPr>
-          <w:rFonts w:ascii="Times New Roman" w:eastAsia="Times New Roman" w:hAnsi="Times New Roman" w:cs="Times New Roman"/>
-          <w:sz w:val="24"/>
-          <w:szCs w:val="24"/>
-        </w:rPr>
-        <w:t xml:space="preserve"> (200): $0</w:t>
-      </w:r>
-    </w:p>
-    <w:p>
-      <w:pPr>
-        <w:numPr>
-          <w:ilvl w:val="0"/>
-          <w:numId w:val="6"/>
-        </w:numPr>
-        <w:spacing w:before="100" w:beforeAutospacing="1" w:after="100" w:afterAutospacing="1" w:line="240" w:lineRule="auto"/>
-        <w:rPr>
-          <w:rFonts w:ascii="Times New Roman" w:eastAsia="Times New Roman" w:hAnsi="Times New Roman" w:cs="Times New Roman"/>
-          <w:sz w:val="24"/>
-          <w:szCs w:val="24"/>
-        </w:rPr>
-      </w:pPr>
-      <w:r>
-        <w:rPr>
-          <w:rFonts w:ascii="Times New Roman" w:eastAsia="Times New Roman" w:hAnsi="Times New Roman" w:cs="Times New Roman"/>
-          <w:b/>
-          <w:bCs/>
-          <w:sz w:val="24"/>
-          <w:szCs w:val="24"/>
-        </w:rPr>
-        <w:t>Total:</w:t>
-      </w:r>
-      <w:r>
-        <w:rPr>
-          <w:rFonts w:ascii="Times New Roman" w:eastAsia="Times New Roman" w:hAnsi="Times New Roman" w:cs="Times New Roman"/>
-          <w:sz w:val="24"/>
-          <w:szCs w:val="24"/>
-        </w:rPr>
-        <w:t xml:space="preserve"> </w:t>
-      </w:r>
-      <w:r>
-        <w:rPr>
-          <w:rFonts w:ascii="Times New Roman" w:eastAsia="Times New Roman" w:hAnsi="Times New Roman" w:cs="Times New Roman"/>
-          <w:b/>
-          <w:bCs/>
-          <w:sz w:val="24"/>
-          <w:szCs w:val="24"/>
-        </w:rPr>
-        <w:t>~$10–12 / month</w:t>
-      </w:r>
-    </w:p>
-    <w:p>
-      <w:pPr>
-        <w:spacing w:before="100" w:beforeAutospacing="1" w:after="100" w:afterAutospacing="1" w:line="240" w:lineRule="auto"/>
-        <w:outlineLvl w:val="2"/>
-        <w:rPr>
-          <w:rFonts w:ascii="Times New Roman" w:eastAsia="Times New Roman" w:hAnsi="Times New Roman" w:cs="Times New Roman"/>
-          <w:b/>
-          <w:bCs/>
-          <w:sz w:val="27"/>
-          <w:szCs w:val="27"/>
-        </w:rPr>
-      </w:pPr>
-      <w:r>
-        <w:rPr>
-          <w:rFonts w:ascii="Times New Roman" w:eastAsia="Times New Roman" w:hAnsi="Times New Roman" w:cs="Times New Roman"/>
-          <w:b/>
-          <w:bCs/>
-          <w:sz w:val="27"/>
-          <w:szCs w:val="27"/>
-        </w:rPr>
-        <w:t>Recommended safer schedule:</w:t>
-      </w:r>
-    </w:p>
-    <w:p>
-      <w:pPr>
-        <w:numPr>
-          <w:ilvl w:val="0"/>
-          <w:numId w:val="7"/>
-        </w:numPr>
-        <w:spacing w:before="100" w:beforeAutospacing="1" w:after="100" w:afterAutospacing="1" w:line="240" w:lineRule="auto"/>
-        <w:rPr>
-          <w:rFonts w:ascii="Times New Roman" w:eastAsia="Times New Roman" w:hAnsi="Times New Roman" w:cs="Times New Roman"/>
-          <w:sz w:val="24"/>
-          <w:szCs w:val="24"/>
-        </w:rPr>
-      </w:pPr>
-      <w:proofErr w:type="spellStart"/>
-      <w:r>
-        <w:rPr>
-          <w:rFonts w:ascii="Times New Roman" w:eastAsia="Times New Roman" w:hAnsi="Times New Roman" w:cs="Times New Roman"/>
-          <w:sz w:val="24"/>
-          <w:szCs w:val="24"/>
-        </w:rPr>
-        <w:t>Instagram</w:t>
-      </w:r>
-      <w:proofErr w:type="spellEnd"/>
-      <w:r>
-        <w:rPr>
-          <w:rFonts w:ascii="Times New Roman" w:eastAsia="Times New Roman" w:hAnsi="Times New Roman" w:cs="Times New Roman"/>
-          <w:sz w:val="24"/>
-          <w:szCs w:val="24"/>
-        </w:rPr>
-        <w:t>: every 48 hours</w:t>
-      </w:r>
-    </w:p>
-    <w:p>
-      <w:pPr>
-        <w:numPr>
-          <w:ilvl w:val="0"/>
-          <w:numId w:val="7"/>
-        </w:numPr>
-        <w:spacing w:before="100" w:beforeAutospacing="1" w:after="100" w:afterAutospacing="1" w:line="240" w:lineRule="auto"/>
-        <w:rPr>
-          <w:rFonts w:ascii="Times New Roman" w:eastAsia="Times New Roman" w:hAnsi="Times New Roman" w:cs="Times New Roman"/>
-          <w:sz w:val="24"/>
-          <w:szCs w:val="24"/>
-        </w:rPr>
-      </w:pPr>
-      <w:proofErr w:type="spellStart"/>
-      <w:r>
-        <w:rPr>
-          <w:rFonts w:ascii="Times New Roman" w:eastAsia="Times New Roman" w:hAnsi="Times New Roman" w:cs="Times New Roman"/>
-          <w:sz w:val="24"/>
-          <w:szCs w:val="24"/>
-        </w:rPr>
-        <w:t>Quora</w:t>
-      </w:r>
-      <w:proofErr w:type="spellEnd"/>
-      <w:r>
-        <w:rPr>
-          <w:rFonts w:ascii="Times New Roman" w:eastAsia="Times New Roman" w:hAnsi="Times New Roman" w:cs="Times New Roman"/>
-          <w:sz w:val="24"/>
-          <w:szCs w:val="24"/>
-        </w:rPr>
-        <w:t>: weekly</w:t>
-      </w:r>
-    </w:p>
-    <w:p>
-      <w:pPr>
-        <w:numPr>
-          <w:ilvl w:val="0"/>
-          <w:numId w:val="7"/>
-        </w:numPr>
-        <w:spacing w:before="100" w:beforeAutospacing="1" w:after="100" w:afterAutospacing="1" w:line="240" w:lineRule="auto"/>
-        <w:rPr>
-          <w:rFonts w:ascii="Times New Roman" w:eastAsia="Times New Roman" w:hAnsi="Times New Roman" w:cs="Times New Roman"/>
-          <w:sz w:val="24"/>
-          <w:szCs w:val="24"/>
-        </w:rPr>
-      </w:pPr>
-      <w:r>
-        <w:rPr>
-          <w:rFonts w:ascii="Times New Roman" w:eastAsia="Times New Roman" w:hAnsi="Times New Roman" w:cs="Times New Roman"/>
-          <w:sz w:val="24"/>
-          <w:szCs w:val="24"/>
-        </w:rPr>
-        <w:t>BHW: every 72 hours</w:t>
-      </w:r>
-    </w:p>
-    <w:p>
-      <w:pPr>
-        <w:spacing w:before="100" w:beforeAutospacing="1" w:after="100" w:afterAutospacing="1" w:line="240" w:lineRule="auto"/>
-        <w:outlineLvl w:val="1"/>
-        <w:rPr>
-          <w:rFonts w:ascii="Times New Roman" w:eastAsia="Times New Roman" w:hAnsi="Times New Roman" w:cs="Times New Roman"/>
-          <w:b/>
-          <w:bCs/>
-          <w:sz w:val="36"/>
-          <w:szCs w:val="36"/>
-        </w:rPr>
-      </w:pPr>
-      <w:r>
-        <w:rPr>
-          <w:rFonts w:ascii="Times New Roman" w:eastAsia="Times New Roman" w:hAnsi="Times New Roman" w:cs="Times New Roman"/>
-          <w:b/>
-          <w:bCs/>
-          <w:sz w:val="36"/>
-          <w:szCs w:val="36"/>
-        </w:rPr>
-        <w:t>4️</w:t>
-      </w:r>
-      <w:r>
-        <w:rPr>
-          <w:rFonts w:ascii="Tahoma" w:eastAsia="Times New Roman" w:hAnsi="Tahoma" w:cs="Tahoma"/>
-          <w:b/>
-          <w:bCs/>
-          <w:sz w:val="36"/>
-          <w:szCs w:val="36"/>
-        </w:rPr>
-        <w:t xml:space="preserve"> </w:t>
-      </w:r>
-      <w:r>
-        <w:rPr>
-          <w:rFonts w:ascii="Times New Roman" w:eastAsia="Times New Roman" w:hAnsi="Times New Roman" w:cs="Times New Roman"/>
-          <w:b/>
-          <w:bCs/>
-          <w:sz w:val="36"/>
-          <w:szCs w:val="36"/>
-        </w:rPr>
-        <w:t>Safety Summary</w:t>
+        <w:t>4️ Safety Summary</w:t>
       </w:r>
     </w:p>
     <w:tbl>
@@ -2270,8 +2195,11 @@
       </w:tr>
     </w:tbl>
     <w:p>
-      <w:bookmarkStart w:id="0" w:name="_GoBack"/>
-      <w:bookmarkEnd w:id="0"/>
+      <w:pPr>
+        <w:rPr>
+          <w:rFonts w:ascii="Times New Roman" w:hAnsi="Times New Roman" w:cs="Times New Roman"/>
+        </w:rPr>
+      </w:pPr>
     </w:p>
     <w:sectPr>
       <w:pgSz w:w="12240" w:h="15840"/>
@@ -2281,6 +2209,56 @@
     </w:sectPr>
   </w:body>
 </w:document>
+</file>
+
+<file path=word/endnotes.xml><?xml version="1.0" encoding="utf-8"?>
+<w:endnotes xmlns:wpc="http://schemas.microsoft.com/office/word/2010/wordprocessingCanvas" xmlns:mc="http://schemas.openxmlformats.org/markup-compatibility/2006" xmlns:o="urn:schemas-microsoft-com:office:office" xmlns:r="http://schemas.openxmlformats.org/officeDocument/2006/relationships" xmlns:m="http://schemas.openxmlformats.org/officeDocument/2006/math" xmlns:v="urn:schemas-microsoft-com:vml" xmlns:wp14="http://schemas.microsoft.com/office/word/2010/wordprocessingDrawing" xmlns:wp="http://schemas.openxmlformats.org/drawingml/2006/wordprocessingDrawing" xmlns:w10="urn:schemas-microsoft-com:office:word" xmlns:w="http://schemas.openxmlformats.org/wordprocessingml/2006/main" xmlns:w14="http://schemas.microsoft.com/office/word/2010/wordml" xmlns:w15="http://schemas.microsoft.com/office/word/2012/wordml" xmlns:wpg="http://schemas.microsoft.com/office/word/2010/wordprocessingGroup" xmlns:wpi="http://schemas.microsoft.com/office/word/2010/wordprocessingInk" xmlns:wne="http://schemas.microsoft.com/office/word/2006/wordml" xmlns:wps="http://schemas.microsoft.com/office/word/2010/wordprocessingShape" mc:Ignorable="w14 w15 wp14">
+  <w:endnote w:type="separator" w:id="-1">
+    <w:p>
+      <w:pPr>
+        <w:spacing w:after="0" w:line="240" w:lineRule="auto"/>
+      </w:pPr>
+      <w:r>
+        <w:separator/>
+      </w:r>
+    </w:p>
+  </w:endnote>
+  <w:endnote w:type="continuationSeparator" w:id="0">
+    <w:p>
+      <w:pPr>
+        <w:spacing w:after="0" w:line="240" w:lineRule="auto"/>
+      </w:pPr>
+      <w:r>
+        <w:continuationSeparator/>
+      </w:r>
+    </w:p>
+  </w:endnote>
+</w:endnotes>
+</file>
+
+<file path=word/footnotes.xml><?xml version="1.0" encoding="utf-8"?>
+<w:footnotes xmlns:wpc="http://schemas.microsoft.com/office/word/2010/wordprocessingCanvas" xmlns:mc="http://schemas.openxmlformats.org/markup-compatibility/2006" xmlns:o="urn:schemas-microsoft-com:office:office" xmlns:r="http://schemas.openxmlformats.org/officeDocument/2006/relationships" xmlns:m="http://schemas.openxmlformats.org/officeDocument/2006/math" xmlns:v="urn:schemas-microsoft-com:vml" xmlns:wp14="http://schemas.microsoft.com/office/word/2010/wordprocessingDrawing" xmlns:wp="http://schemas.openxmlformats.org/drawingml/2006/wordprocessingDrawing" xmlns:w10="urn:schemas-microsoft-com:office:word" xmlns:w="http://schemas.openxmlformats.org/wordprocessingml/2006/main" xmlns:w14="http://schemas.microsoft.com/office/word/2010/wordml" xmlns:w15="http://schemas.microsoft.com/office/word/2012/wordml" xmlns:wpg="http://schemas.microsoft.com/office/word/2010/wordprocessingGroup" xmlns:wpi="http://schemas.microsoft.com/office/word/2010/wordprocessingInk" xmlns:wne="http://schemas.microsoft.com/office/word/2006/wordml" xmlns:wps="http://schemas.microsoft.com/office/word/2010/wordprocessingShape" mc:Ignorable="w14 w15 wp14">
+  <w:footnote w:type="separator" w:id="-1">
+    <w:p>
+      <w:pPr>
+        <w:spacing w:after="0" w:line="240" w:lineRule="auto"/>
+      </w:pPr>
+      <w:r>
+        <w:separator/>
+      </w:r>
+    </w:p>
+  </w:footnote>
+  <w:footnote w:type="continuationSeparator" w:id="0">
+    <w:p>
+      <w:pPr>
+        <w:spacing w:after="0" w:line="240" w:lineRule="auto"/>
+      </w:pPr>
+      <w:r>
+        <w:continuationSeparator/>
+      </w:r>
+    </w:p>
+  </w:footnote>
+</w:footnotes>
 </file>
 
 <file path=word/numbering.xml><?xml version="1.0" encoding="utf-8"?>
@@ -4042,6 +4020,50 @@
       <w:iCs/>
     </w:rPr>
   </w:style>
+  <w:style w:type="paragraph" w:styleId="Header">
+    <w:name w:val="header"/>
+    <w:basedOn w:val="Normal"/>
+    <w:link w:val="HeaderChar"/>
+    <w:uiPriority w:val="99"/>
+    <w:unhideWhenUsed/>
+    <w:rsid w:val="00ED4F3E"/>
+    <w:pPr>
+      <w:tabs>
+        <w:tab w:val="center" w:pos="4680"/>
+        <w:tab w:val="right" w:pos="9360"/>
+      </w:tabs>
+      <w:spacing w:after="0" w:line="240" w:lineRule="auto"/>
+    </w:pPr>
+  </w:style>
+  <w:style w:type="character" w:customStyle="1" w:styleId="HeaderChar">
+    <w:name w:val="Header Char"/>
+    <w:basedOn w:val="DefaultParagraphFont"/>
+    <w:link w:val="Header"/>
+    <w:uiPriority w:val="99"/>
+    <w:rsid w:val="00ED4F3E"/>
+  </w:style>
+  <w:style w:type="paragraph" w:styleId="Footer">
+    <w:name w:val="footer"/>
+    <w:basedOn w:val="Normal"/>
+    <w:link w:val="FooterChar"/>
+    <w:uiPriority w:val="99"/>
+    <w:unhideWhenUsed/>
+    <w:rsid w:val="00ED4F3E"/>
+    <w:pPr>
+      <w:tabs>
+        <w:tab w:val="center" w:pos="4680"/>
+        <w:tab w:val="right" w:pos="9360"/>
+      </w:tabs>
+      <w:spacing w:after="0" w:line="240" w:lineRule="auto"/>
+    </w:pPr>
+  </w:style>
+  <w:style w:type="character" w:customStyle="1" w:styleId="FooterChar">
+    <w:name w:val="Footer Char"/>
+    <w:basedOn w:val="DefaultParagraphFont"/>
+    <w:link w:val="Footer"/>
+    <w:uiPriority w:val="99"/>
+    <w:rsid w:val="00ED4F3E"/>
+  </w:style>
 </w:styles>
 </file>
 

</xml_diff>